<commit_message>
docs: explain frontend and backend technology choices
</commit_message>
<xml_diff>
--- a/docs/10-系統元件與資料庫使用手冊.docx
+++ b/docs/10-系統元件與資料庫使用手冊.docx
@@ -24,10 +24,9 @@
         <w:t>?????2026-07-13??????????????</w:t>
       </w:r>
     </w:p>
-    <w:p/>
     <w:p>
       <w:pPr>
-        <w:ind w:left="340" w:right="340"/>
+        <w:ind w:left="340"/>
       </w:pPr>
       <w:r>
         <w:rPr>
@@ -40,7 +39,7 @@
     </w:p>
     <w:p>
       <w:pPr>
-        <w:ind w:left="340" w:right="340"/>
+        <w:ind w:left="340"/>
       </w:pPr>
       <w:r>
         <w:rPr>
@@ -97,7 +96,7 @@
               <w:rPr>
                 <w:rFonts w:ascii="Microsoft JhengHei" w:hAnsi="Microsoft JhengHei" w:eastAsia="Microsoft JhengHei"/>
                 <w:b/>
-                <w:sz w:val="18"/>
+                <w:sz w:val="17"/>
               </w:rPr>
               <w:t>元件</w:t>
             </w:r>
@@ -117,7 +116,7 @@
               <w:rPr>
                 <w:rFonts w:ascii="Microsoft JhengHei" w:hAnsi="Microsoft JhengHei" w:eastAsia="Microsoft JhengHei"/>
                 <w:b/>
-                <w:sz w:val="18"/>
+                <w:sz w:val="17"/>
               </w:rPr>
               <w:t>目錄／服務</w:t>
             </w:r>
@@ -137,7 +136,7 @@
               <w:rPr>
                 <w:rFonts w:ascii="Microsoft JhengHei" w:hAnsi="Microsoft JhengHei" w:eastAsia="Microsoft JhengHei"/>
                 <w:b/>
-                <w:sz w:val="18"/>
+                <w:sz w:val="17"/>
               </w:rPr>
               <w:t>用途</w:t>
             </w:r>
@@ -157,7 +156,7 @@
             <w:r>
               <w:rPr>
                 <w:rFonts w:ascii="Microsoft JhengHei" w:hAnsi="Microsoft JhengHei" w:eastAsia="Microsoft JhengHei"/>
-                <w:sz w:val="18"/>
+                <w:sz w:val="17"/>
               </w:rPr>
               <w:t>公開人才前端</w:t>
             </w:r>
@@ -175,7 +174,7 @@
             <w:r>
               <w:rPr>
                 <w:rFonts w:ascii="Microsoft JhengHei" w:hAnsi="Microsoft JhengHei" w:eastAsia="Microsoft JhengHei"/>
-                <w:sz w:val="18"/>
+                <w:sz w:val="17"/>
               </w:rPr>
               <w:t>career-frontend/</w:t>
             </w:r>
@@ -193,7 +192,7 @@
             <w:r>
               <w:rPr>
                 <w:rFonts w:ascii="Microsoft JhengHei" w:hAnsi="Microsoft JhengHei" w:eastAsia="Microsoft JhengHei"/>
-                <w:sz w:val="18"/>
+                <w:sz w:val="17"/>
               </w:rPr>
               <w:t>求職者查看公開職缺、應徵職缺或直接留下履歷；不需註冊登入</w:t>
             </w:r>
@@ -213,7 +212,7 @@
             <w:r>
               <w:rPr>
                 <w:rFonts w:ascii="Microsoft JhengHei" w:hAnsi="Microsoft JhengHei" w:eastAsia="Microsoft JhengHei"/>
-                <w:sz w:val="18"/>
+                <w:sz w:val="17"/>
               </w:rPr>
               <w:t>HR 管理後台</w:t>
             </w:r>
@@ -231,7 +230,7 @@
             <w:r>
               <w:rPr>
                 <w:rFonts w:ascii="Microsoft JhengHei" w:hAnsi="Microsoft JhengHei" w:eastAsia="Microsoft JhengHei"/>
-                <w:sz w:val="18"/>
+                <w:sz w:val="17"/>
               </w:rPr>
               <w:t>frontend/</w:t>
             </w:r>
@@ -249,7 +248,7 @@
             <w:r>
               <w:rPr>
                 <w:rFonts w:ascii="Microsoft JhengHei" w:hAnsi="Microsoft JhengHei" w:eastAsia="Microsoft JhengHei"/>
-                <w:sz w:val="18"/>
+                <w:sz w:val="17"/>
               </w:rPr>
               <w:t>HR、主管與管理員登入後管理人才、履歷、職缺、配對、報表與系統資料</w:t>
             </w:r>
@@ -269,7 +268,7 @@
             <w:r>
               <w:rPr>
                 <w:rFonts w:ascii="Microsoft JhengHei" w:hAnsi="Microsoft JhengHei" w:eastAsia="Microsoft JhengHei"/>
-                <w:sz w:val="18"/>
+                <w:sz w:val="17"/>
               </w:rPr>
               <w:t>Backend API</w:t>
             </w:r>
@@ -287,7 +286,7 @@
             <w:r>
               <w:rPr>
                 <w:rFonts w:ascii="Microsoft JhengHei" w:hAnsi="Microsoft JhengHei" w:eastAsia="Microsoft JhengHei"/>
-                <w:sz w:val="18"/>
+                <w:sz w:val="17"/>
               </w:rPr>
               <w:t>backend/</w:t>
             </w:r>
@@ -305,7 +304,7 @@
             <w:r>
               <w:rPr>
                 <w:rFonts w:ascii="Microsoft JhengHei" w:hAnsi="Microsoft JhengHei" w:eastAsia="Microsoft JhengHei"/>
-                <w:sz w:val="18"/>
+                <w:sz w:val="17"/>
               </w:rPr>
               <w:t>驗證、權限、資料驗證、履歷處理、配對、報表及資料庫存取</w:t>
             </w:r>
@@ -325,7 +324,7 @@
             <w:r>
               <w:rPr>
                 <w:rFonts w:ascii="Microsoft JhengHei" w:hAnsi="Microsoft JhengHei" w:eastAsia="Microsoft JhengHei"/>
-                <w:sz w:val="18"/>
+                <w:sz w:val="17"/>
               </w:rPr>
               <w:t>PostgreSQL</w:t>
             </w:r>
@@ -343,7 +342,7 @@
             <w:r>
               <w:rPr>
                 <w:rFonts w:ascii="Microsoft JhengHei" w:hAnsi="Microsoft JhengHei" w:eastAsia="Microsoft JhengHei"/>
-                <w:sz w:val="18"/>
+                <w:sz w:val="17"/>
               </w:rPr>
               <w:t>Compose 的 postgres</w:t>
             </w:r>
@@ -361,7 +360,7 @@
             <w:r>
               <w:rPr>
                 <w:rFonts w:ascii="Microsoft JhengHei" w:hAnsi="Microsoft JhengHei" w:eastAsia="Microsoft JhengHei"/>
-                <w:sz w:val="18"/>
+                <w:sz w:val="17"/>
               </w:rPr>
               <w:t>正式資料庫，保存結構化人才、職缺、流程、權限及稽核資料</w:t>
             </w:r>
@@ -381,7 +380,7 @@
             <w:r>
               <w:rPr>
                 <w:rFonts w:ascii="Microsoft JhengHei" w:hAnsi="Microsoft JhengHei" w:eastAsia="Microsoft JhengHei"/>
-                <w:sz w:val="18"/>
+                <w:sz w:val="17"/>
               </w:rPr>
               <w:t>履歷檔案儲存</w:t>
             </w:r>
@@ -399,7 +398,7 @@
             <w:r>
               <w:rPr>
                 <w:rFonts w:ascii="Microsoft JhengHei" w:hAnsi="Microsoft JhengHei" w:eastAsia="Microsoft JhengHei"/>
-                <w:sz w:val="18"/>
+                <w:sz w:val="17"/>
               </w:rPr>
               <w:t>Local volume 或 S3／MinIO</w:t>
             </w:r>
@@ -417,7 +416,7 @@
             <w:r>
               <w:rPr>
                 <w:rFonts w:ascii="Microsoft JhengHei" w:hAnsi="Microsoft JhengHei" w:eastAsia="Microsoft JhengHei"/>
-                <w:sz w:val="18"/>
+                <w:sz w:val="17"/>
               </w:rPr>
               <w:t>保存 PDF、DOC、DOCX 原檔；DB 只存 key、hash、大小及解析結果，不存檔案 binary</w:t>
             </w:r>
@@ -540,6 +539,756 @@
     </w:p>
     <w:p>
       <w:pPr>
+        <w:pStyle w:val="Heading3"/>
+      </w:pPr>
+      <w:r>
+        <w:rPr>
+          <w:rFonts w:ascii="Microsoft JhengHei" w:hAnsi="Microsoft JhengHei" w:eastAsia="Microsoft JhengHei"/>
+        </w:rPr>
+        <w:t>1.1 為什麼前後端使用不同技術？</w:t>
+      </w:r>
+    </w:p>
+    <w:p>
+      <w:r>
+        <w:rPr>
+          <w:rFonts w:ascii="Microsoft JhengHei" w:hAnsi="Microsoft JhengHei" w:eastAsia="Microsoft JhengHei"/>
+        </w:rPr>
+        <w:t>可以把 TalentHub 想成一間餐廳：</w:t>
+      </w:r>
+    </w:p>
+    <w:p>
+      <w:pPr>
+        <w:pStyle w:val="ListBullet"/>
+      </w:pPr>
+      <w:r>
+        <w:rPr>
+          <w:rFonts w:ascii="Microsoft JhengHei" w:hAnsi="Microsoft JhengHei" w:eastAsia="Microsoft JhengHei"/>
+        </w:rPr>
+        <w:t>前端是用餐區與服務人員：負責讓使用者看得懂、填得快、立即知道哪裡需要修正。</w:t>
+      </w:r>
+    </w:p>
+    <w:p>
+      <w:pPr>
+        <w:pStyle w:val="ListBullet"/>
+      </w:pPr>
+      <w:r>
+        <w:rPr>
+          <w:rFonts w:ascii="Microsoft JhengHei" w:hAnsi="Microsoft JhengHei" w:eastAsia="Microsoft JhengHei"/>
+        </w:rPr>
+        <w:t>Backend 是廚房：負責驗證資料、解析履歷、計算配對分數，以及決定資料可以如何被使用。</w:t>
+      </w:r>
+    </w:p>
+    <w:p>
+      <w:pPr>
+        <w:pStyle w:val="ListBullet"/>
+      </w:pPr>
+      <w:r>
+        <w:rPr>
+          <w:rFonts w:ascii="Microsoft JhengHei" w:hAnsi="Microsoft JhengHei" w:eastAsia="Microsoft JhengHei"/>
+        </w:rPr>
+        <w:t>資料庫是倉庫與帳本：負責長期、正確地保存人才、職缺、權限與操作紀錄。</w:t>
+      </w:r>
+    </w:p>
+    <w:p>
+      <w:pPr>
+        <w:pStyle w:val="ListBullet"/>
+      </w:pPr>
+      <w:r>
+        <w:rPr>
+          <w:rFonts w:ascii="Microsoft JhengHei" w:hAnsi="Microsoft JhengHei" w:eastAsia="Microsoft JhengHei"/>
+        </w:rPr>
+        <w:t>履歷儲存是文件庫：保存 PDF、DOC、DOCX 原始檔，資料庫只記錄檔案位置與解析結果。</w:t>
+      </w:r>
+    </w:p>
+    <w:p>
+      <w:r>
+        <w:rPr>
+          <w:rFonts w:ascii="Microsoft JhengHei" w:hAnsi="Microsoft JhengHei" w:eastAsia="Microsoft JhengHei"/>
+        </w:rPr>
+        <w:t>各層工作不同，因此選擇最適合該工作的工具，比強迫全部使用同一種語言更容易維護。</w:t>
+      </w:r>
+    </w:p>
+    <w:p>
+      <w:pPr>
+        <w:pStyle w:val="Heading3"/>
+      </w:pPr>
+      <w:r>
+        <w:rPr>
+          <w:rFonts w:ascii="Microsoft JhengHei" w:hAnsi="Microsoft JhengHei" w:eastAsia="Microsoft JhengHei"/>
+        </w:rPr>
+        <w:t>1.2 技術選擇對照表</w:t>
+      </w:r>
+    </w:p>
+    <w:tbl>
+      <w:tblPr>
+        <w:tblStyle w:val="TableGrid"/>
+        <w:tblW w:type="auto" w:w="0"/>
+        <w:jc w:val="center"/>
+        <w:tblLook w:firstColumn="1" w:firstRow="1" w:lastColumn="0" w:lastRow="0" w:noHBand="0" w:noVBand="1" w:val="04A0"/>
+      </w:tblPr>
+      <w:tblGrid>
+        <w:gridCol w:w="2353"/>
+        <w:gridCol w:w="2353"/>
+        <w:gridCol w:w="2353"/>
+        <w:gridCol w:w="2353"/>
+      </w:tblGrid>
+      <w:tr>
+        <w:tc>
+          <w:tcPr>
+            <w:tcW w:type="dxa" w:w="2353"/>
+            <w:vAlign w:val="center"/>
+            <w:shd w:fill="DDEBE5"/>
+          </w:tcPr>
+          <w:p>
+            <w:pPr>
+              <w:spacing w:after="40"/>
+            </w:pPr>
+            <w:r>
+              <w:rPr>
+                <w:rFonts w:ascii="Microsoft JhengHei" w:hAnsi="Microsoft JhengHei" w:eastAsia="Microsoft JhengHei"/>
+                <w:b/>
+                <w:sz w:val="17"/>
+              </w:rPr>
+              <w:t>系統層</w:t>
+            </w:r>
+          </w:p>
+        </w:tc>
+        <w:tc>
+          <w:tcPr>
+            <w:tcW w:type="dxa" w:w="2353"/>
+            <w:vAlign w:val="center"/>
+            <w:shd w:fill="DDEBE5"/>
+          </w:tcPr>
+          <w:p>
+            <w:pPr>
+              <w:spacing w:after="40"/>
+            </w:pPr>
+            <w:r>
+              <w:rPr>
+                <w:rFonts w:ascii="Microsoft JhengHei" w:hAnsi="Microsoft JhengHei" w:eastAsia="Microsoft JhengHei"/>
+                <w:b/>
+                <w:sz w:val="17"/>
+              </w:rPr>
+              <w:t>使用技術</w:t>
+            </w:r>
+          </w:p>
+        </w:tc>
+        <w:tc>
+          <w:tcPr>
+            <w:tcW w:type="dxa" w:w="2353"/>
+            <w:vAlign w:val="center"/>
+            <w:shd w:fill="DDEBE5"/>
+          </w:tcPr>
+          <w:p>
+            <w:pPr>
+              <w:spacing w:after="40"/>
+            </w:pPr>
+            <w:r>
+              <w:rPr>
+                <w:rFonts w:ascii="Microsoft JhengHei" w:hAnsi="Microsoft JhengHei" w:eastAsia="Microsoft JhengHei"/>
+                <w:b/>
+                <w:sz w:val="17"/>
+              </w:rPr>
+              <w:t>主要負責工作</w:t>
+            </w:r>
+          </w:p>
+        </w:tc>
+        <w:tc>
+          <w:tcPr>
+            <w:tcW w:type="dxa" w:w="2353"/>
+            <w:vAlign w:val="center"/>
+            <w:shd w:fill="DDEBE5"/>
+          </w:tcPr>
+          <w:p>
+            <w:pPr>
+              <w:spacing w:after="40"/>
+            </w:pPr>
+            <w:r>
+              <w:rPr>
+                <w:rFonts w:ascii="Microsoft JhengHei" w:hAnsi="Microsoft JhengHei" w:eastAsia="Microsoft JhengHei"/>
+                <w:b/>
+                <w:sz w:val="17"/>
+              </w:rPr>
+              <w:t>選擇原因</w:t>
+            </w:r>
+          </w:p>
+        </w:tc>
+      </w:tr>
+      <w:tr>
+        <w:tc>
+          <w:tcPr>
+            <w:tcW w:type="dxa" w:w="2353"/>
+            <w:vAlign w:val="center"/>
+          </w:tcPr>
+          <w:p>
+            <w:pPr>
+              <w:spacing w:after="40"/>
+            </w:pPr>
+            <w:r>
+              <w:rPr>
+                <w:rFonts w:ascii="Microsoft JhengHei" w:hAnsi="Microsoft JhengHei" w:eastAsia="Microsoft JhengHei"/>
+                <w:sz w:val="17"/>
+              </w:rPr>
+              <w:t>公開人才前端</w:t>
+            </w:r>
+          </w:p>
+        </w:tc>
+        <w:tc>
+          <w:tcPr>
+            <w:tcW w:type="dxa" w:w="2353"/>
+            <w:vAlign w:val="center"/>
+          </w:tcPr>
+          <w:p>
+            <w:pPr>
+              <w:spacing w:after="40"/>
+            </w:pPr>
+            <w:r>
+              <w:rPr>
+                <w:rFonts w:ascii="Microsoft JhengHei" w:hAnsi="Microsoft JhengHei" w:eastAsia="Microsoft JhengHei"/>
+                <w:sz w:val="17"/>
+              </w:rPr>
+              <w:t>Vue 3＋TypeScript</w:t>
+            </w:r>
+          </w:p>
+        </w:tc>
+        <w:tc>
+          <w:tcPr>
+            <w:tcW w:type="dxa" w:w="2353"/>
+            <w:vAlign w:val="center"/>
+          </w:tcPr>
+          <w:p>
+            <w:pPr>
+              <w:spacing w:after="40"/>
+            </w:pPr>
+            <w:r>
+              <w:rPr>
+                <w:rFonts w:ascii="Microsoft JhengHei" w:hAnsi="Microsoft JhengHei" w:eastAsia="Microsoft JhengHei"/>
+                <w:sz w:val="17"/>
+              </w:rPr>
+              <w:t>職缺瀏覽、人才表單、下拉選單、履歷上傳、錯誤提示</w:t>
+            </w:r>
+          </w:p>
+        </w:tc>
+        <w:tc>
+          <w:tcPr>
+            <w:tcW w:type="dxa" w:w="2353"/>
+            <w:vAlign w:val="center"/>
+          </w:tcPr>
+          <w:p>
+            <w:pPr>
+              <w:spacing w:after="40"/>
+            </w:pPr>
+            <w:r>
+              <w:rPr>
+                <w:rFonts w:ascii="Microsoft JhengHei" w:hAnsi="Microsoft JhengHei" w:eastAsia="Microsoft JhengHei"/>
+                <w:sz w:val="17"/>
+              </w:rPr>
+              <w:t>Vue 適合互動表單與元件化畫面；TypeScript 可在開發階段找出欄位型別錯誤</w:t>
+            </w:r>
+          </w:p>
+        </w:tc>
+      </w:tr>
+      <w:tr>
+        <w:tc>
+          <w:tcPr>
+            <w:tcW w:type="dxa" w:w="2353"/>
+            <w:vAlign w:val="center"/>
+          </w:tcPr>
+          <w:p>
+            <w:pPr>
+              <w:spacing w:after="40"/>
+            </w:pPr>
+            <w:r>
+              <w:rPr>
+                <w:rFonts w:ascii="Microsoft JhengHei" w:hAnsi="Microsoft JhengHei" w:eastAsia="Microsoft JhengHei"/>
+                <w:sz w:val="17"/>
+              </w:rPr>
+              <w:t>HR 管理後台</w:t>
+            </w:r>
+          </w:p>
+        </w:tc>
+        <w:tc>
+          <w:tcPr>
+            <w:tcW w:type="dxa" w:w="2353"/>
+            <w:vAlign w:val="center"/>
+          </w:tcPr>
+          <w:p>
+            <w:pPr>
+              <w:spacing w:after="40"/>
+            </w:pPr>
+            <w:r>
+              <w:rPr>
+                <w:rFonts w:ascii="Microsoft JhengHei" w:hAnsi="Microsoft JhengHei" w:eastAsia="Microsoft JhengHei"/>
+                <w:sz w:val="17"/>
+              </w:rPr>
+              <w:t>Vue 3＋TypeScript</w:t>
+            </w:r>
+          </w:p>
+        </w:tc>
+        <w:tc>
+          <w:tcPr>
+            <w:tcW w:type="dxa" w:w="2353"/>
+            <w:vAlign w:val="center"/>
+          </w:tcPr>
+          <w:p>
+            <w:pPr>
+              <w:spacing w:after="40"/>
+            </w:pPr>
+            <w:r>
+              <w:rPr>
+                <w:rFonts w:ascii="Microsoft JhengHei" w:hAnsi="Microsoft JhengHei" w:eastAsia="Microsoft JhengHei"/>
+                <w:sz w:val="17"/>
+              </w:rPr>
+              <w:t>人才列表、搜尋篩選、履歷校對、職缺、配對、報表及系統管理</w:t>
+            </w:r>
+          </w:p>
+        </w:tc>
+        <w:tc>
+          <w:tcPr>
+            <w:tcW w:type="dxa" w:w="2353"/>
+            <w:vAlign w:val="center"/>
+          </w:tcPr>
+          <w:p>
+            <w:pPr>
+              <w:spacing w:after="40"/>
+            </w:pPr>
+            <w:r>
+              <w:rPr>
+                <w:rFonts w:ascii="Microsoft JhengHei" w:hAnsi="Microsoft JhengHei" w:eastAsia="Microsoft JhengHei"/>
+                <w:sz w:val="17"/>
+              </w:rPr>
+              <w:t>管理後台有大量重複的表格、按鈕與表單，元件可以重複使用並保持操作一致</w:t>
+            </w:r>
+          </w:p>
+        </w:tc>
+      </w:tr>
+      <w:tr>
+        <w:tc>
+          <w:tcPr>
+            <w:tcW w:type="dxa" w:w="2353"/>
+            <w:vAlign w:val="center"/>
+          </w:tcPr>
+          <w:p>
+            <w:pPr>
+              <w:spacing w:after="40"/>
+            </w:pPr>
+            <w:r>
+              <w:rPr>
+                <w:rFonts w:ascii="Microsoft JhengHei" w:hAnsi="Microsoft JhengHei" w:eastAsia="Microsoft JhengHei"/>
+                <w:sz w:val="17"/>
+              </w:rPr>
+              <w:t>Backend API</w:t>
+            </w:r>
+          </w:p>
+        </w:tc>
+        <w:tc>
+          <w:tcPr>
+            <w:tcW w:type="dxa" w:w="2353"/>
+            <w:vAlign w:val="center"/>
+          </w:tcPr>
+          <w:p>
+            <w:pPr>
+              <w:spacing w:after="40"/>
+            </w:pPr>
+            <w:r>
+              <w:rPr>
+                <w:rFonts w:ascii="Microsoft JhengHei" w:hAnsi="Microsoft JhengHei" w:eastAsia="Microsoft JhengHei"/>
+                <w:sz w:val="17"/>
+              </w:rPr>
+              <w:t>Python＋FastAPI</w:t>
+            </w:r>
+          </w:p>
+        </w:tc>
+        <w:tc>
+          <w:tcPr>
+            <w:tcW w:type="dxa" w:w="2353"/>
+            <w:vAlign w:val="center"/>
+          </w:tcPr>
+          <w:p>
+            <w:pPr>
+              <w:spacing w:after="40"/>
+            </w:pPr>
+            <w:r>
+              <w:rPr>
+                <w:rFonts w:ascii="Microsoft JhengHei" w:hAnsi="Microsoft JhengHei" w:eastAsia="Microsoft JhengHei"/>
+                <w:sz w:val="17"/>
+              </w:rPr>
+              <w:t>權限、資料驗證、履歷解析、OCR、去重、配對及報表</w:t>
+            </w:r>
+          </w:p>
+        </w:tc>
+        <w:tc>
+          <w:tcPr>
+            <w:tcW w:type="dxa" w:w="2353"/>
+            <w:vAlign w:val="center"/>
+          </w:tcPr>
+          <w:p>
+            <w:pPr>
+              <w:spacing w:after="40"/>
+            </w:pPr>
+            <w:r>
+              <w:rPr>
+                <w:rFonts w:ascii="Microsoft JhengHei" w:hAnsi="Microsoft JhengHei" w:eastAsia="Microsoft JhengHei"/>
+                <w:sz w:val="17"/>
+              </w:rPr>
+              <w:t>Python 有成熟的文件解析、OCR、資料處理與 AI 工具；FastAPI 可快速建立有型別驗證及 API 文件的服務</w:t>
+            </w:r>
+          </w:p>
+        </w:tc>
+      </w:tr>
+      <w:tr>
+        <w:tc>
+          <w:tcPr>
+            <w:tcW w:type="dxa" w:w="2353"/>
+            <w:vAlign w:val="center"/>
+          </w:tcPr>
+          <w:p>
+            <w:pPr>
+              <w:spacing w:after="40"/>
+            </w:pPr>
+            <w:r>
+              <w:rPr>
+                <w:rFonts w:ascii="Microsoft JhengHei" w:hAnsi="Microsoft JhengHei" w:eastAsia="Microsoft JhengHei"/>
+                <w:sz w:val="17"/>
+              </w:rPr>
+              <w:t>正式資料庫</w:t>
+            </w:r>
+          </w:p>
+        </w:tc>
+        <w:tc>
+          <w:tcPr>
+            <w:tcW w:type="dxa" w:w="2353"/>
+            <w:vAlign w:val="center"/>
+          </w:tcPr>
+          <w:p>
+            <w:pPr>
+              <w:spacing w:after="40"/>
+            </w:pPr>
+            <w:r>
+              <w:rPr>
+                <w:rFonts w:ascii="Microsoft JhengHei" w:hAnsi="Microsoft JhengHei" w:eastAsia="Microsoft JhengHei"/>
+                <w:sz w:val="17"/>
+              </w:rPr>
+              <w:t>PostgreSQL＋SQL</w:t>
+            </w:r>
+          </w:p>
+        </w:tc>
+        <w:tc>
+          <w:tcPr>
+            <w:tcW w:type="dxa" w:w="2353"/>
+            <w:vAlign w:val="center"/>
+          </w:tcPr>
+          <w:p>
+            <w:pPr>
+              <w:spacing w:after="40"/>
+            </w:pPr>
+            <w:r>
+              <w:rPr>
+                <w:rFonts w:ascii="Microsoft JhengHei" w:hAnsi="Microsoft JhengHei" w:eastAsia="Microsoft JhengHei"/>
+                <w:sz w:val="17"/>
+              </w:rPr>
+              <w:t>保存人才、經歷、技能、履歷、職缺、配對、帳號及稽核資料</w:t>
+            </w:r>
+          </w:p>
+        </w:tc>
+        <w:tc>
+          <w:tcPr>
+            <w:tcW w:type="dxa" w:w="2353"/>
+            <w:vAlign w:val="center"/>
+          </w:tcPr>
+          <w:p>
+            <w:pPr>
+              <w:spacing w:after="40"/>
+            </w:pPr>
+            <w:r>
+              <w:rPr>
+                <w:rFonts w:ascii="Microsoft JhengHei" w:hAnsi="Microsoft JhengHei" w:eastAsia="Microsoft JhengHei"/>
+                <w:sz w:val="17"/>
+              </w:rPr>
+              <w:t>支援交易、外鍵、索引、複雜查詢、多人同時操作及正式備份還原</w:t>
+            </w:r>
+          </w:p>
+        </w:tc>
+      </w:tr>
+      <w:tr>
+        <w:tc>
+          <w:tcPr>
+            <w:tcW w:type="dxa" w:w="2353"/>
+            <w:vAlign w:val="center"/>
+          </w:tcPr>
+          <w:p>
+            <w:pPr>
+              <w:spacing w:after="40"/>
+            </w:pPr>
+            <w:r>
+              <w:rPr>
+                <w:rFonts w:ascii="Microsoft JhengHei" w:hAnsi="Microsoft JhengHei" w:eastAsia="Microsoft JhengHei"/>
+                <w:sz w:val="17"/>
+              </w:rPr>
+              <w:t>本機測試資料庫</w:t>
+            </w:r>
+          </w:p>
+        </w:tc>
+        <w:tc>
+          <w:tcPr>
+            <w:tcW w:type="dxa" w:w="2353"/>
+            <w:vAlign w:val="center"/>
+          </w:tcPr>
+          <w:p>
+            <w:pPr>
+              <w:spacing w:after="40"/>
+            </w:pPr>
+            <w:r>
+              <w:rPr>
+                <w:rFonts w:ascii="Microsoft JhengHei" w:hAnsi="Microsoft JhengHei" w:eastAsia="Microsoft JhengHei"/>
+                <w:sz w:val="17"/>
+              </w:rPr>
+              <w:t>SQLite</w:t>
+            </w:r>
+          </w:p>
+        </w:tc>
+        <w:tc>
+          <w:tcPr>
+            <w:tcW w:type="dxa" w:w="2353"/>
+            <w:vAlign w:val="center"/>
+          </w:tcPr>
+          <w:p>
+            <w:pPr>
+              <w:spacing w:after="40"/>
+            </w:pPr>
+            <w:r>
+              <w:rPr>
+                <w:rFonts w:ascii="Microsoft JhengHei" w:hAnsi="Microsoft JhengHei" w:eastAsia="Microsoft JhengHei"/>
+                <w:sz w:val="17"/>
+              </w:rPr>
+              <w:t>單元測試及快速本機驗證</w:t>
+            </w:r>
+          </w:p>
+        </w:tc>
+        <w:tc>
+          <w:tcPr>
+            <w:tcW w:type="dxa" w:w="2353"/>
+            <w:vAlign w:val="center"/>
+          </w:tcPr>
+          <w:p>
+            <w:pPr>
+              <w:spacing w:after="40"/>
+            </w:pPr>
+            <w:r>
+              <w:rPr>
+                <w:rFonts w:ascii="Microsoft JhengHei" w:hAnsi="Microsoft JhengHei" w:eastAsia="Microsoft JhengHei"/>
+                <w:sz w:val="17"/>
+              </w:rPr>
+              <w:t>不需另外安裝資料庫服務；啟動快速，但不作為正式多人環境</w:t>
+            </w:r>
+          </w:p>
+        </w:tc>
+      </w:tr>
+    </w:tbl>
+    <w:p/>
+    <w:p>
+      <w:pPr>
+        <w:pStyle w:val="Heading3"/>
+      </w:pPr>
+      <w:r>
+        <w:rPr>
+          <w:rFonts w:ascii="Microsoft JhengHei" w:hAnsi="Microsoft JhengHei" w:eastAsia="Microsoft JhengHei"/>
+        </w:rPr>
+        <w:t>1.3 從畫面到資料庫的架構圖</w:t>
+      </w:r>
+    </w:p>
+    <w:p>
+      <w:pPr>
+        <w:pStyle w:val="CodeBlock"/>
+      </w:pPr>
+      <w:r>
+        <w:t>┌──────────────────────── 使用者看到的畫面 ────────────────────────┐</w:t>
+        <w:br/>
+        <w:t>│  求職者 → 公開人才前端（Vue＋TypeScript）                       │</w:t>
+        <w:br/>
+        <w:t>│  HR／主管／Admin → HR 管理後台（Vue＋TypeScript）               │</w:t>
+        <w:br/>
+        <w:t>└────────────────────────────┬───────────────────────────────────┘</w:t>
+        <w:br/>
+        <w:t xml:space="preserve">                             │ HTTPS／JSON／履歷檔案</w:t>
+        <w:br/>
+        <w:t xml:space="preserve">                             ▼</w:t>
+        <w:br/>
+        <w:t>┌──────────────────────── 系統處理中心 ───────────────────────────┐</w:t>
+        <w:br/>
+        <w:t>│  Backend API（Python＋FastAPI）                                 │</w:t>
+        <w:br/>
+        <w:t>│  驗證身分與權限 → 檢查欄位 → 解析履歷／OCR → 去重／配對／報表   │</w:t>
+        <w:br/>
+        <w:t>└───────────────────────┬───────────────────┬────────────────────┘</w:t>
+        <w:br/>
+        <w:t xml:space="preserve">                        │ 結構化資料         │ PDF／DOC／DOCX 原檔</w:t>
+        <w:br/>
+        <w:t xml:space="preserve">                        ▼                    ▼</w:t>
+        <w:br/>
+        <w:t xml:space="preserve">              ┌──────────────────┐  ┌─────────────────────────┐</w:t>
+        <w:br/>
+        <w:t xml:space="preserve">              │ PostgreSQL       │  │ Local／S3／MinIO        │</w:t>
+        <w:br/>
+        <w:t xml:space="preserve">              │ 人才、職缺、權限 │  │ 履歷原始檔案            │</w:t>
+        <w:br/>
+        <w:t xml:space="preserve">              │ 配對、稽核紀錄   │  │ 隔離區與惡意檔案掃描    │</w:t>
+        <w:br/>
+        <w:t xml:space="preserve">              └──────────────────┘  └─────────────────────────┘</w:t>
+      </w:r>
+    </w:p>
+    <w:p>
+      <w:pPr>
+        <w:pStyle w:val="Heading3"/>
+      </w:pPr>
+      <w:r>
+        <w:rPr>
+          <w:rFonts w:ascii="Microsoft JhengHei" w:hAnsi="Microsoft JhengHei" w:eastAsia="Microsoft JhengHei"/>
+        </w:rPr>
+        <w:t>1.4 各項選擇的白話原因</w:t>
+      </w:r>
+    </w:p>
+    <w:p>
+      <w:r>
+        <w:rPr>
+          <w:rFonts w:ascii="Microsoft JhengHei" w:hAnsi="Microsoft JhengHei" w:eastAsia="Microsoft JhengHei"/>
+        </w:rPr>
+        <w:t>前端使用 Vue 3＋TypeScript</w:t>
+      </w:r>
+    </w:p>
+    <w:p>
+      <w:pPr>
+        <w:pStyle w:val="ListBullet"/>
+      </w:pPr>
+      <w:r>
+        <w:rPr>
+          <w:rFonts w:ascii="Microsoft JhengHei" w:hAnsi="Microsoft JhengHei" w:eastAsia="Microsoft JhengHei"/>
+        </w:rPr>
+        <w:t>Vue 適合人才表單、資料表格、篩選器、彈出視窗等互動畫面，並能將畫面拆成可重複使用的元件。</w:t>
+      </w:r>
+    </w:p>
+    <w:p>
+      <w:pPr>
+        <w:pStyle w:val="ListBullet"/>
+      </w:pPr>
+      <w:r>
+        <w:rPr>
+          <w:rFonts w:ascii="Microsoft JhengHei" w:hAnsi="Microsoft JhengHei" w:eastAsia="Microsoft JhengHei"/>
+        </w:rPr>
+        <w:t>公開人才網站與 HR 後台都採用相同前端技術，工程師不必維護兩套不同的畫面框架。</w:t>
+      </w:r>
+    </w:p>
+    <w:p>
+      <w:pPr>
+        <w:pStyle w:val="ListBullet"/>
+      </w:pPr>
+      <w:r>
+        <w:rPr>
+          <w:rFonts w:ascii="Microsoft JhengHei" w:hAnsi="Microsoft JhengHei" w:eastAsia="Microsoft JhengHei"/>
+        </w:rPr>
+        <w:t>TypeScript 會檢查資料型別。例如 API 回傳的人才缺少 name，或年資被誤傳成文字時，開發階段就較容易發現。</w:t>
+      </w:r>
+    </w:p>
+    <w:p>
+      <w:r>
+        <w:rPr>
+          <w:rFonts w:ascii="Microsoft JhengHei" w:hAnsi="Microsoft JhengHei" w:eastAsia="Microsoft JhengHei"/>
+        </w:rPr>
+        <w:t>Backend 使用 Python＋FastAPI</w:t>
+      </w:r>
+    </w:p>
+    <w:p>
+      <w:pPr>
+        <w:pStyle w:val="ListBullet"/>
+      </w:pPr>
+      <w:r>
+        <w:rPr>
+          <w:rFonts w:ascii="Microsoft JhengHei" w:hAnsi="Microsoft JhengHei" w:eastAsia="Microsoft JhengHei"/>
+        </w:rPr>
+        <w:t>本系統不只有資料新增與修改，還需要處理 104、1111、一般履歷、PDF、DOCX、OCR、技能正規化及配對計分。</w:t>
+      </w:r>
+    </w:p>
+    <w:p>
+      <w:pPr>
+        <w:pStyle w:val="ListBullet"/>
+      </w:pPr>
+      <w:r>
+        <w:rPr>
+          <w:rFonts w:ascii="Microsoft JhengHei" w:hAnsi="Microsoft JhengHei" w:eastAsia="Microsoft JhengHei"/>
+        </w:rPr>
+        <w:t>Python 在文件解析、OCR、資料清理與未來 AI 輔助解析方面有成熟工具，適合本專案的核心工作。</w:t>
+      </w:r>
+    </w:p>
+    <w:p>
+      <w:pPr>
+        <w:pStyle w:val="ListBullet"/>
+      </w:pPr>
+      <w:r>
+        <w:rPr>
+          <w:rFonts w:ascii="Microsoft JhengHei" w:hAnsi="Microsoft JhengHei" w:eastAsia="Microsoft JhengHei"/>
+        </w:rPr>
+        <w:t>FastAPI 可驗證前端送來的資料、自動產生 OpenAPI／Swagger 文件，並容易整合 JWT、RBAC、檔案上傳及自動測試。</w:t>
+      </w:r>
+    </w:p>
+    <w:p>
+      <w:r>
+        <w:rPr>
+          <w:rFonts w:ascii="Microsoft JhengHei" w:hAnsi="Microsoft JhengHei" w:eastAsia="Microsoft JhengHei"/>
+        </w:rPr>
+        <w:t>正式資料庫使用 PostgreSQL</w:t>
+      </w:r>
+    </w:p>
+    <w:p>
+      <w:pPr>
+        <w:pStyle w:val="ListBullet"/>
+      </w:pPr>
+      <w:r>
+        <w:rPr>
+          <w:rFonts w:ascii="Microsoft JhengHei" w:hAnsi="Microsoft JhengHei" w:eastAsia="Microsoft JhengHei"/>
+        </w:rPr>
+        <w:t>一位人才可能有多筆學歷、經歷、技能、履歷、應徵與配對結果，屬於需要明確關聯的資料。</w:t>
+      </w:r>
+    </w:p>
+    <w:p>
+      <w:pPr>
+        <w:pStyle w:val="ListBullet"/>
+      </w:pPr>
+      <w:r>
+        <w:rPr>
+          <w:rFonts w:ascii="Microsoft JhengHei" w:hAnsi="Microsoft JhengHei" w:eastAsia="Microsoft JhengHei"/>
+        </w:rPr>
+        <w:t>PostgreSQL 的交易可避免只寫入一半資料；外鍵可避免履歷連到不存在的人才；索引則能提升大量人才篩選速度。</w:t>
+      </w:r>
+    </w:p>
+    <w:p>
+      <w:pPr>
+        <w:pStyle w:val="ListBullet"/>
+      </w:pPr>
+      <w:r>
+        <w:rPr>
+          <w:rFonts w:ascii="Microsoft JhengHei" w:hAnsi="Microsoft JhengHei" w:eastAsia="Microsoft JhengHei"/>
+        </w:rPr>
+        <w:t>PostgreSQL 適合多人同時操作，也具備正式環境所需的備份、還原與權限能力。</w:t>
+      </w:r>
+    </w:p>
+    <w:p>
+      <w:r>
+        <w:rPr>
+          <w:rFonts w:ascii="Microsoft JhengHei" w:hAnsi="Microsoft JhengHei" w:eastAsia="Microsoft JhengHei"/>
+        </w:rPr>
+        <w:t>為什麼不全部使用同一種語言？</w:t>
+      </w:r>
+    </w:p>
+    <w:p>
+      <w:r>
+        <w:rPr>
+          <w:rFonts w:ascii="Microsoft JhengHei" w:hAnsi="Microsoft JhengHei" w:eastAsia="Microsoft JhengHei"/>
+        </w:rPr>
+        <w:t>全部使用 JavaScript／TypeScript 可以減少語言種類，但會放棄 Python 在履歷解析、OCR 與資料處理上的優勢。 目前的分工讓 Vue＋TypeScript 專注於畫面與操作、Python＋FastAPI 專注於規則與文件處理、PostgreSQL 專注於可靠保存資料。 不同層透過清楚的 HTTP API 規格溝通，因此仍能分開測試、替換與維護。</w:t>
+      </w:r>
+    </w:p>
+    <w:p>
+      <w:pPr>
         <w:pStyle w:val="Heading2"/>
       </w:pPr>
       <w:r>
@@ -587,7 +1336,7 @@
               <w:rPr>
                 <w:rFonts w:ascii="Microsoft JhengHei" w:hAnsi="Microsoft JhengHei" w:eastAsia="Microsoft JhengHei"/>
                 <w:b/>
-                <w:sz w:val="18"/>
+                <w:sz w:val="17"/>
               </w:rPr>
               <w:t>項目</w:t>
             </w:r>
@@ -607,7 +1356,7 @@
               <w:rPr>
                 <w:rFonts w:ascii="Microsoft JhengHei" w:hAnsi="Microsoft JhengHei" w:eastAsia="Microsoft JhengHei"/>
                 <w:b/>
-                <w:sz w:val="18"/>
+                <w:sz w:val="17"/>
               </w:rPr>
               <w:t>PostgreSQL 16</w:t>
             </w:r>
@@ -627,7 +1376,7 @@
               <w:rPr>
                 <w:rFonts w:ascii="Microsoft JhengHei" w:hAnsi="Microsoft JhengHei" w:eastAsia="Microsoft JhengHei"/>
                 <w:b/>
-                <w:sz w:val="18"/>
+                <w:sz w:val="17"/>
               </w:rPr>
               <w:t>SQLite</w:t>
             </w:r>
@@ -647,7 +1396,7 @@
             <w:r>
               <w:rPr>
                 <w:rFonts w:ascii="Microsoft JhengHei" w:hAnsi="Microsoft JhengHei" w:eastAsia="Microsoft JhengHei"/>
-                <w:sz w:val="18"/>
+                <w:sz w:val="17"/>
               </w:rPr>
               <w:t>定位</w:t>
             </w:r>
@@ -665,7 +1414,7 @@
             <w:r>
               <w:rPr>
                 <w:rFonts w:ascii="Microsoft JhengHei" w:hAnsi="Microsoft JhengHei" w:eastAsia="Microsoft JhengHei"/>
-                <w:sz w:val="18"/>
+                <w:sz w:val="17"/>
               </w:rPr>
               <w:t>正式部署與整合驗證的資料庫</w:t>
             </w:r>
@@ -683,7 +1432,7 @@
             <w:r>
               <w:rPr>
                 <w:rFonts w:ascii="Microsoft JhengHei" w:hAnsi="Microsoft JhengHei" w:eastAsia="Microsoft JhengHei"/>
-                <w:sz w:val="18"/>
+                <w:sz w:val="17"/>
               </w:rPr>
               <w:t>單元測試、快速本機檢查</w:t>
             </w:r>
@@ -703,7 +1452,7 @@
             <w:r>
               <w:rPr>
                 <w:rFonts w:ascii="Microsoft JhengHei" w:hAnsi="Microsoft JhengHei" w:eastAsia="Microsoft JhengHei"/>
-                <w:sz w:val="18"/>
+                <w:sz w:val="17"/>
               </w:rPr>
               <w:t>多使用者／併發</w:t>
             </w:r>
@@ -721,7 +1470,7 @@
             <w:r>
               <w:rPr>
                 <w:rFonts w:ascii="Microsoft JhengHei" w:hAnsi="Microsoft JhengHei" w:eastAsia="Microsoft JhengHei"/>
-                <w:sz w:val="18"/>
+                <w:sz w:val="17"/>
               </w:rPr>
               <w:t>適合</w:t>
             </w:r>
@@ -739,7 +1488,7 @@
             <w:r>
               <w:rPr>
                 <w:rFonts w:ascii="Microsoft JhengHei" w:hAnsi="Microsoft JhengHei" w:eastAsia="Microsoft JhengHei"/>
-                <w:sz w:val="18"/>
+                <w:sz w:val="17"/>
               </w:rPr>
               <w:t>不適合作為正式多人系統</w:t>
             </w:r>
@@ -759,7 +1508,7 @@
             <w:r>
               <w:rPr>
                 <w:rFonts w:ascii="Microsoft JhengHei" w:hAnsi="Microsoft JhengHei" w:eastAsia="Microsoft JhengHei"/>
-                <w:sz w:val="18"/>
+                <w:sz w:val="17"/>
               </w:rPr>
               <w:t>型別</w:t>
             </w:r>
@@ -777,7 +1526,7 @@
             <w:r>
               <w:rPr>
                 <w:rFonts w:ascii="Microsoft JhengHei" w:hAnsi="Microsoft JhengHei" w:eastAsia="Microsoft JhengHei"/>
-                <w:sz w:val="18"/>
+                <w:sz w:val="17"/>
               </w:rPr>
               <w:t>真正 BIGINT、時區 timestamp、JSON</w:t>
             </w:r>
@@ -795,7 +1544,7 @@
             <w:r>
               <w:rPr>
                 <w:rFonts w:ascii="Microsoft JhengHei" w:hAnsi="Microsoft JhengHei" w:eastAsia="Microsoft JhengHei"/>
-                <w:sz w:val="18"/>
+                <w:sz w:val="17"/>
               </w:rPr>
               <w:t>測試時有型別簡化與反射差異</w:t>
             </w:r>
@@ -815,7 +1564,7 @@
             <w:r>
               <w:rPr>
                 <w:rFonts w:ascii="Microsoft JhengHei" w:hAnsi="Microsoft JhengHei" w:eastAsia="Microsoft JhengHei"/>
-                <w:sz w:val="18"/>
+                <w:sz w:val="17"/>
               </w:rPr>
               <w:t>備份</w:t>
             </w:r>
@@ -833,7 +1582,7 @@
             <w:r>
               <w:rPr>
                 <w:rFonts w:ascii="Microsoft JhengHei" w:hAnsi="Microsoft JhengHei" w:eastAsia="Microsoft JhengHei"/>
-                <w:sz w:val="18"/>
+                <w:sz w:val="17"/>
               </w:rPr>
               <w:t>pg_dump／pg_restore、託管快照</w:t>
             </w:r>
@@ -851,7 +1600,7 @@
             <w:r>
               <w:rPr>
                 <w:rFonts w:ascii="Microsoft JhengHei" w:hAnsi="Microsoft JhengHei" w:eastAsia="Microsoft JhengHei"/>
-                <w:sz w:val="18"/>
+                <w:sz w:val="17"/>
               </w:rPr>
               <w:t>複製單一 DB 檔案，但不能代表 PostgreSQL 備份測試</w:t>
             </w:r>
@@ -871,7 +1620,7 @@
             <w:r>
               <w:rPr>
                 <w:rFonts w:ascii="Microsoft JhengHei" w:hAnsi="Microsoft JhengHei" w:eastAsia="Microsoft JhengHei"/>
-                <w:sz w:val="18"/>
+                <w:sz w:val="17"/>
               </w:rPr>
               <w:t>建議</w:t>
             </w:r>
@@ -889,7 +1638,7 @@
             <w:r>
               <w:rPr>
                 <w:rFonts w:ascii="Microsoft JhengHei" w:hAnsi="Microsoft JhengHei" w:eastAsia="Microsoft JhengHei"/>
-                <w:sz w:val="18"/>
+                <w:sz w:val="17"/>
               </w:rPr>
               <w:t>正式環境唯一選擇</w:t>
             </w:r>
@@ -907,7 +1656,7 @@
             <w:r>
               <w:rPr>
                 <w:rFonts w:ascii="Microsoft JhengHei" w:hAnsi="Microsoft JhengHei" w:eastAsia="Microsoft JhengHei"/>
-                <w:sz w:val="18"/>
+                <w:sz w:val="17"/>
               </w:rPr>
               <w:t>不可用來宣稱 PostgreSQL migration 已驗證</w:t>
             </w:r>
@@ -1111,7 +1860,7 @@
               <w:rPr>
                 <w:rFonts w:ascii="Microsoft JhengHei" w:hAnsi="Microsoft JhengHei" w:eastAsia="Microsoft JhengHei"/>
                 <w:b/>
-                <w:sz w:val="18"/>
+                <w:sz w:val="17"/>
               </w:rPr>
               <w:t>資料表</w:t>
             </w:r>
@@ -1131,7 +1880,7 @@
               <w:rPr>
                 <w:rFonts w:ascii="Microsoft JhengHei" w:hAnsi="Microsoft JhengHei" w:eastAsia="Microsoft JhengHei"/>
                 <w:b/>
-                <w:sz w:val="18"/>
+                <w:sz w:val="17"/>
               </w:rPr>
               <w:t>用途與主要欄位</w:t>
             </w:r>
@@ -1151,7 +1900,7 @@
               <w:rPr>
                 <w:rFonts w:ascii="Microsoft JhengHei" w:hAnsi="Microsoft JhengHei" w:eastAsia="Microsoft JhengHei"/>
                 <w:b/>
-                <w:sz w:val="18"/>
+                <w:sz w:val="17"/>
               </w:rPr>
               <w:t>關聯</w:t>
             </w:r>
@@ -1171,7 +1920,7 @@
               <w:rPr>
                 <w:rFonts w:ascii="Microsoft JhengHei" w:hAnsi="Microsoft JhengHei" w:eastAsia="Microsoft JhengHei"/>
                 <w:b/>
-                <w:sz w:val="18"/>
+                <w:sz w:val="17"/>
               </w:rPr>
               <w:t>資料來源</w:t>
             </w:r>
@@ -1191,7 +1940,7 @@
             <w:r>
               <w:rPr>
                 <w:rFonts w:ascii="Microsoft JhengHei" w:hAnsi="Microsoft JhengHei" w:eastAsia="Microsoft JhengHei"/>
-                <w:sz w:val="18"/>
+                <w:sz w:val="17"/>
               </w:rPr>
               <w:t>departments</w:t>
             </w:r>
@@ -1209,7 +1958,7 @@
             <w:r>
               <w:rPr>
                 <w:rFonts w:ascii="Microsoft JhengHei" w:hAnsi="Microsoft JhengHei" w:eastAsia="Microsoft JhengHei"/>
-                <w:sz w:val="18"/>
+                <w:sz w:val="17"/>
               </w:rPr>
               <w:t>部門階層；name、parent_id、is_active</w:t>
             </w:r>
@@ -1227,7 +1976,7 @@
             <w:r>
               <w:rPr>
                 <w:rFonts w:ascii="Microsoft JhengHei" w:hAnsi="Microsoft JhengHei" w:eastAsia="Microsoft JhengHei"/>
-                <w:sz w:val="18"/>
+                <w:sz w:val="17"/>
               </w:rPr>
               <w:t>parent_id 自關聯；被 users、jobs、audit 引用</w:t>
             </w:r>
@@ -1245,7 +1994,7 @@
             <w:r>
               <w:rPr>
                 <w:rFonts w:ascii="Microsoft JhengHei" w:hAnsi="Microsoft JhengHei" w:eastAsia="Microsoft JhengHei"/>
-                <w:sz w:val="18"/>
+                <w:sz w:val="17"/>
               </w:rPr>
               <w:t>Admin 後台建立／修改</w:t>
             </w:r>
@@ -1265,7 +2014,7 @@
             <w:r>
               <w:rPr>
                 <w:rFonts w:ascii="Microsoft JhengHei" w:hAnsi="Microsoft JhengHei" w:eastAsia="Microsoft JhengHei"/>
-                <w:sz w:val="18"/>
+                <w:sz w:val="17"/>
               </w:rPr>
               <w:t>users</w:t>
             </w:r>
@@ -1283,7 +2032,7 @@
             <w:r>
               <w:rPr>
                 <w:rFonts w:ascii="Microsoft JhengHei" w:hAnsi="Microsoft JhengHei" w:eastAsia="Microsoft JhengHei"/>
-                <w:sz w:val="18"/>
+                <w:sz w:val="17"/>
               </w:rPr>
               <w:t>登入帳號；username、email、password_hash、display_name、role、department_id、is_active</w:t>
             </w:r>
@@ -1301,7 +2050,7 @@
             <w:r>
               <w:rPr>
                 <w:rFonts w:ascii="Microsoft JhengHei" w:hAnsi="Microsoft JhengHei" w:eastAsia="Microsoft JhengHei"/>
-                <w:sz w:val="18"/>
+                <w:sz w:val="17"/>
               </w:rPr>
               <w:t>所屬 department；被 refresh token、audit 等引用</w:t>
             </w:r>
@@ -1319,7 +2068,7 @@
             <w:r>
               <w:rPr>
                 <w:rFonts w:ascii="Microsoft JhengHei" w:hAnsi="Microsoft JhengHei" w:eastAsia="Microsoft JhengHei"/>
-                <w:sz w:val="18"/>
+                <w:sz w:val="17"/>
               </w:rPr>
               <w:t>首位管理員 bootstrap；其後由 Admin 管理</w:t>
             </w:r>
@@ -1339,7 +2088,7 @@
             <w:r>
               <w:rPr>
                 <w:rFonts w:ascii="Microsoft JhengHei" w:hAnsi="Microsoft JhengHei" w:eastAsia="Microsoft JhengHei"/>
-                <w:sz w:val="18"/>
+                <w:sz w:val="17"/>
               </w:rPr>
               <w:t>refresh_tokens</w:t>
             </w:r>
@@ -1357,7 +2106,7 @@
             <w:r>
               <w:rPr>
                 <w:rFonts w:ascii="Microsoft JhengHei" w:hAnsi="Microsoft JhengHei" w:eastAsia="Microsoft JhengHei"/>
-                <w:sz w:val="18"/>
+                <w:sz w:val="17"/>
               </w:rPr>
               <w:t>Refresh token 輪替與撤銷；只存 jti_hash、到期與撤銷時間，不存明文 token</w:t>
             </w:r>
@@ -1375,7 +2124,7 @@
             <w:r>
               <w:rPr>
                 <w:rFonts w:ascii="Microsoft JhengHei" w:hAnsi="Microsoft JhengHei" w:eastAsia="Microsoft JhengHei"/>
-                <w:sz w:val="18"/>
+                <w:sz w:val="17"/>
               </w:rPr>
               <w:t>user_id → users.id，使用者刪除時 cascade</w:t>
             </w:r>
@@ -1393,7 +2142,7 @@
             <w:r>
               <w:rPr>
                 <w:rFonts w:ascii="Microsoft JhengHei" w:hAnsi="Microsoft JhengHei" w:eastAsia="Microsoft JhengHei"/>
-                <w:sz w:val="18"/>
+                <w:sz w:val="17"/>
               </w:rPr>
               <w:t>登入及 refresh API 自動建立</w:t>
             </w:r>
@@ -1449,7 +2198,7 @@
               <w:rPr>
                 <w:rFonts w:ascii="Microsoft JhengHei" w:hAnsi="Microsoft JhengHei" w:eastAsia="Microsoft JhengHei"/>
                 <w:b/>
-                <w:sz w:val="18"/>
+                <w:sz w:val="17"/>
               </w:rPr>
               <w:t>資料表</w:t>
             </w:r>
@@ -1469,7 +2218,7 @@
               <w:rPr>
                 <w:rFonts w:ascii="Microsoft JhengHei" w:hAnsi="Microsoft JhengHei" w:eastAsia="Microsoft JhengHei"/>
                 <w:b/>
-                <w:sz w:val="18"/>
+                <w:sz w:val="17"/>
               </w:rPr>
               <w:t>用途與主要欄位</w:t>
             </w:r>
@@ -1489,7 +2238,7 @@
               <w:rPr>
                 <w:rFonts w:ascii="Microsoft JhengHei" w:hAnsi="Microsoft JhengHei" w:eastAsia="Microsoft JhengHei"/>
                 <w:b/>
-                <w:sz w:val="18"/>
+                <w:sz w:val="17"/>
               </w:rPr>
               <w:t>關聯</w:t>
             </w:r>
@@ -1509,7 +2258,7 @@
               <w:rPr>
                 <w:rFonts w:ascii="Microsoft JhengHei" w:hAnsi="Microsoft JhengHei" w:eastAsia="Microsoft JhengHei"/>
                 <w:b/>
-                <w:sz w:val="18"/>
+                <w:sz w:val="17"/>
               </w:rPr>
               <w:t>資料來源</w:t>
             </w:r>
@@ -1529,7 +2278,7 @@
             <w:r>
               <w:rPr>
                 <w:rFonts w:ascii="Microsoft JhengHei" w:hAnsi="Microsoft JhengHei" w:eastAsia="Microsoft JhengHei"/>
-                <w:sz w:val="18"/>
+                <w:sz w:val="17"/>
               </w:rPr>
               <w:t>candidates</w:t>
             </w:r>
@@ -1547,7 +2296,7 @@
             <w:r>
               <w:rPr>
                 <w:rFonts w:ascii="Microsoft JhengHei" w:hAnsi="Microsoft JhengHei" w:eastAsia="Microsoft JhengHei"/>
-                <w:sz w:val="18"/>
+                <w:sz w:val="17"/>
               </w:rPr>
               <w:t>人才主檔；代碼、姓名、正規化 Email／電話、城市、學歷、年資、現職、期望條件、來源、狀態、同意、黑名單、保存期限、軟刪除時間</w:t>
             </w:r>
@@ -1565,7 +2314,7 @@
             <w:r>
               <w:rPr>
                 <w:rFonts w:ascii="Microsoft JhengHei" w:hAnsi="Microsoft JhengHei" w:eastAsia="Microsoft JhengHei"/>
-                <w:sz w:val="18"/>
+                <w:sz w:val="17"/>
               </w:rPr>
               <w:t>owner 可連 users；一對多教育、經歷、技能、活動、履歷、投遞、配對</w:t>
             </w:r>
@@ -1583,7 +2332,7 @@
             <w:r>
               <w:rPr>
                 <w:rFonts w:ascii="Microsoft JhengHei" w:hAnsi="Microsoft JhengHei" w:eastAsia="Microsoft JhengHei"/>
-                <w:sz w:val="18"/>
+                <w:sz w:val="17"/>
               </w:rPr>
               <w:t>公開投遞、HR 手動建立、履歷確認入庫</w:t>
             </w:r>
@@ -1603,7 +2352,7 @@
             <w:r>
               <w:rPr>
                 <w:rFonts w:ascii="Microsoft JhengHei" w:hAnsi="Microsoft JhengHei" w:eastAsia="Microsoft JhengHei"/>
-                <w:sz w:val="18"/>
+                <w:sz w:val="17"/>
               </w:rPr>
               <w:t>candidate_educations</w:t>
             </w:r>
@@ -1621,7 +2370,7 @@
             <w:r>
               <w:rPr>
                 <w:rFonts w:ascii="Microsoft JhengHei" w:hAnsi="Microsoft JhengHei" w:eastAsia="Microsoft JhengHei"/>
-                <w:sz w:val="18"/>
+                <w:sz w:val="17"/>
               </w:rPr>
               <w:t>學校、主修、學位、起訖年月、畢業狀態與順序</w:t>
             </w:r>
@@ -1639,7 +2388,7 @@
             <w:r>
               <w:rPr>
                 <w:rFonts w:ascii="Microsoft JhengHei" w:hAnsi="Microsoft JhengHei" w:eastAsia="Microsoft JhengHei"/>
-                <w:sz w:val="18"/>
+                <w:sz w:val="17"/>
               </w:rPr>
               <w:t>candidate_id → candidates.id，刪除人才時 cascade</w:t>
             </w:r>
@@ -1657,7 +2406,7 @@
             <w:r>
               <w:rPr>
                 <w:rFonts w:ascii="Microsoft JhengHei" w:hAnsi="Microsoft JhengHei" w:eastAsia="Microsoft JhengHei"/>
-                <w:sz w:val="18"/>
+                <w:sz w:val="17"/>
               </w:rPr>
               <w:t>Model 與 DB 已具備；目前主要 UI 尚未提供完整逐筆編輯</w:t>
             </w:r>
@@ -1677,7 +2426,7 @@
             <w:r>
               <w:rPr>
                 <w:rFonts w:ascii="Microsoft JhengHei" w:hAnsi="Microsoft JhengHei" w:eastAsia="Microsoft JhengHei"/>
-                <w:sz w:val="18"/>
+                <w:sz w:val="17"/>
               </w:rPr>
               <w:t>candidate_experiences</w:t>
             </w:r>
@@ -1695,7 +2444,7 @@
             <w:r>
               <w:rPr>
                 <w:rFonts w:ascii="Microsoft JhengHei" w:hAnsi="Microsoft JhengHei" w:eastAsia="Microsoft JhengHei"/>
-                <w:sz w:val="18"/>
+                <w:sz w:val="17"/>
               </w:rPr>
               <w:t>公司、職稱、產業、起訖年月、年資、說明與順序</w:t>
             </w:r>
@@ -1713,7 +2462,7 @@
             <w:r>
               <w:rPr>
                 <w:rFonts w:ascii="Microsoft JhengHei" w:hAnsi="Microsoft JhengHei" w:eastAsia="Microsoft JhengHei"/>
-                <w:sz w:val="18"/>
+                <w:sz w:val="17"/>
               </w:rPr>
               <w:t>candidate_id → candidates.id，刪除人才時 cascade</w:t>
             </w:r>
@@ -1731,7 +2480,7 @@
             <w:r>
               <w:rPr>
                 <w:rFonts w:ascii="Microsoft JhengHei" w:hAnsi="Microsoft JhengHei" w:eastAsia="Microsoft JhengHei"/>
-                <w:sz w:val="18"/>
+                <w:sz w:val="17"/>
               </w:rPr>
               <w:t>Model 與 DB 已具備；目前主要 UI 尚未提供完整逐筆編輯</w:t>
             </w:r>
@@ -1751,7 +2500,7 @@
             <w:r>
               <w:rPr>
                 <w:rFonts w:ascii="Microsoft JhengHei" w:hAnsi="Microsoft JhengHei" w:eastAsia="Microsoft JhengHei"/>
-                <w:sz w:val="18"/>
+                <w:sz w:val="17"/>
               </w:rPr>
               <w:t>candidate_skills</w:t>
             </w:r>
@@ -1769,7 +2518,7 @@
             <w:r>
               <w:rPr>
                 <w:rFonts w:ascii="Microsoft JhengHei" w:hAnsi="Microsoft JhengHei" w:eastAsia="Microsoft JhengHei"/>
-                <w:sz w:val="18"/>
+                <w:sz w:val="17"/>
               </w:rPr>
               <w:t>可搜尋的正規化技能；skill、skill_norm</w:t>
             </w:r>
@@ -1787,7 +2536,7 @@
             <w:r>
               <w:rPr>
                 <w:rFonts w:ascii="Microsoft JhengHei" w:hAnsi="Microsoft JhengHei" w:eastAsia="Microsoft JhengHei"/>
-                <w:sz w:val="18"/>
+                <w:sz w:val="17"/>
               </w:rPr>
               <w:t>每位人才的 skill_norm 不可重複</w:t>
             </w:r>
@@ -1805,7 +2554,7 @@
             <w:r>
               <w:rPr>
                 <w:rFonts w:ascii="Microsoft JhengHei" w:hAnsi="Microsoft JhengHei" w:eastAsia="Microsoft JhengHei"/>
-                <w:sz w:val="18"/>
+                <w:sz w:val="17"/>
               </w:rPr>
               <w:t>履歷確認入庫時由解析／校對技能建立</w:t>
             </w:r>
@@ -1825,7 +2574,7 @@
             <w:r>
               <w:rPr>
                 <w:rFonts w:ascii="Microsoft JhengHei" w:hAnsi="Microsoft JhengHei" w:eastAsia="Microsoft JhengHei"/>
-                <w:sz w:val="18"/>
+                <w:sz w:val="17"/>
               </w:rPr>
               <w:t>candidate_activities</w:t>
             </w:r>
@@ -1843,7 +2592,7 @@
             <w:r>
               <w:rPr>
                 <w:rFonts w:ascii="Microsoft JhengHei" w:hAnsi="Microsoft JhengHei" w:eastAsia="Microsoft JhengHei"/>
-                <w:sz w:val="18"/>
+                <w:sz w:val="17"/>
               </w:rPr>
               <w:t>聯繫、備註、面談等歷程；type、content、happened_at</w:t>
             </w:r>
@@ -1861,7 +2610,7 @@
             <w:r>
               <w:rPr>
                 <w:rFonts w:ascii="Microsoft JhengHei" w:hAnsi="Microsoft JhengHei" w:eastAsia="Microsoft JhengHei"/>
-                <w:sz w:val="18"/>
+                <w:sz w:val="17"/>
               </w:rPr>
               <w:t>candidate_id → candidates.id；user_id → users.id</w:t>
             </w:r>
@@ -1879,7 +2628,7 @@
             <w:r>
               <w:rPr>
                 <w:rFonts w:ascii="Microsoft JhengHei" w:hAnsi="Microsoft JhengHei" w:eastAsia="Microsoft JhengHei"/>
-                <w:sz w:val="18"/>
+                <w:sz w:val="17"/>
               </w:rPr>
               <w:t>HR 後台新增活動紀錄</w:t>
             </w:r>
@@ -1935,7 +2684,7 @@
               <w:rPr>
                 <w:rFonts w:ascii="Microsoft JhengHei" w:hAnsi="Microsoft JhengHei" w:eastAsia="Microsoft JhengHei"/>
                 <w:b/>
-                <w:sz w:val="18"/>
+                <w:sz w:val="17"/>
               </w:rPr>
               <w:t>資料表</w:t>
             </w:r>
@@ -1955,7 +2704,7 @@
               <w:rPr>
                 <w:rFonts w:ascii="Microsoft JhengHei" w:hAnsi="Microsoft JhengHei" w:eastAsia="Microsoft JhengHei"/>
                 <w:b/>
-                <w:sz w:val="18"/>
+                <w:sz w:val="17"/>
               </w:rPr>
               <w:t>用途與主要欄位</w:t>
             </w:r>
@@ -1975,7 +2724,7 @@
               <w:rPr>
                 <w:rFonts w:ascii="Microsoft JhengHei" w:hAnsi="Microsoft JhengHei" w:eastAsia="Microsoft JhengHei"/>
                 <w:b/>
-                <w:sz w:val="18"/>
+                <w:sz w:val="17"/>
               </w:rPr>
               <w:t>關聯</w:t>
             </w:r>
@@ -1995,7 +2744,7 @@
               <w:rPr>
                 <w:rFonts w:ascii="Microsoft JhengHei" w:hAnsi="Microsoft JhengHei" w:eastAsia="Microsoft JhengHei"/>
                 <w:b/>
-                <w:sz w:val="18"/>
+                <w:sz w:val="17"/>
               </w:rPr>
               <w:t>資料來源</w:t>
             </w:r>
@@ -2015,7 +2764,7 @@
             <w:r>
               <w:rPr>
                 <w:rFonts w:ascii="Microsoft JhengHei" w:hAnsi="Microsoft JhengHei" w:eastAsia="Microsoft JhengHei"/>
-                <w:sz w:val="18"/>
+                <w:sz w:val="17"/>
               </w:rPr>
               <w:t>job_requisitions</w:t>
             </w:r>
@@ -2033,7 +2782,7 @@
             <w:r>
               <w:rPr>
                 <w:rFonts w:ascii="Microsoft JhengHei" w:hAnsi="Microsoft JhengHei" w:eastAsia="Microsoft JhengHei"/>
-                <w:sz w:val="18"/>
+                <w:sz w:val="17"/>
               </w:rPr>
               <w:t>職缺需求；單號、部門、需求人數、地點、薪資、年資／學歷條件、JD、技能 JSON、權重、狀態及發布／補齊／關閉時間</w:t>
             </w:r>
@@ -2051,7 +2800,7 @@
             <w:r>
               <w:rPr>
                 <w:rFonts w:ascii="Microsoft JhengHei" w:hAnsi="Microsoft JhengHei" w:eastAsia="Microsoft JhengHei"/>
-                <w:sz w:val="18"/>
+                <w:sz w:val="17"/>
               </w:rPr>
               <w:t>department、requested/approved user；一對多 applications、matches</w:t>
             </w:r>
@@ -2069,7 +2818,7 @@
             <w:r>
               <w:rPr>
                 <w:rFonts w:ascii="Microsoft JhengHei" w:hAnsi="Microsoft JhengHei" w:eastAsia="Microsoft JhengHei"/>
-                <w:sz w:val="18"/>
+                <w:sz w:val="17"/>
               </w:rPr>
               <w:t>HR 後台建立、編輯、核准</w:t>
             </w:r>
@@ -2089,7 +2838,7 @@
             <w:r>
               <w:rPr>
                 <w:rFonts w:ascii="Microsoft JhengHei" w:hAnsi="Microsoft JhengHei" w:eastAsia="Microsoft JhengHei"/>
-                <w:sz w:val="18"/>
+                <w:sz w:val="17"/>
               </w:rPr>
               <w:t>resume_files</w:t>
             </w:r>
@@ -2107,7 +2856,7 @@
             <w:r>
               <w:rPr>
                 <w:rFonts w:ascii="Microsoft JhengHei" w:hAnsi="Microsoft JhengHei" w:eastAsia="Microsoft JhengHei"/>
-                <w:sz w:val="18"/>
+                <w:sz w:val="17"/>
               </w:rPr>
               <w:t>履歷原檔 metadata 與解析結果；storage_key、檔名、SHA-256 hash、大小、MIME、來源平台、解析狀態、文字、payload、信心分數</w:t>
             </w:r>
@@ -2125,7 +2874,7 @@
             <w:r>
               <w:rPr>
                 <w:rFonts w:ascii="Microsoft JhengHei" w:hAnsi="Microsoft JhengHei" w:eastAsia="Microsoft JhengHei"/>
-                <w:sz w:val="18"/>
+                <w:sz w:val="17"/>
               </w:rPr>
               <w:t>可連 candidate_id；被 application 引用</w:t>
             </w:r>
@@ -2143,7 +2892,7 @@
             <w:r>
               <w:rPr>
                 <w:rFonts w:ascii="Microsoft JhengHei" w:hAnsi="Microsoft JhengHei" w:eastAsia="Microsoft JhengHei"/>
-                <w:sz w:val="18"/>
+                <w:sz w:val="17"/>
               </w:rPr>
               <w:t>公開人才前端或 HR 批次上傳</w:t>
             </w:r>
@@ -2163,7 +2912,7 @@
             <w:r>
               <w:rPr>
                 <w:rFonts w:ascii="Microsoft JhengHei" w:hAnsi="Microsoft JhengHei" w:eastAsia="Microsoft JhengHei"/>
-                <w:sz w:val="18"/>
+                <w:sz w:val="17"/>
               </w:rPr>
               <w:t>job_applications</w:t>
             </w:r>
@@ -2181,7 +2930,7 @@
             <w:r>
               <w:rPr>
                 <w:rFonts w:ascii="Microsoft JhengHei" w:hAnsi="Microsoft JhengHei" w:eastAsia="Microsoft JhengHei"/>
-                <w:sz w:val="18"/>
+                <w:sz w:val="17"/>
               </w:rPr>
               <w:t>人才對職缺的投遞；履歷、cover letter、作品連結、流程狀態、來源</w:t>
             </w:r>
@@ -2199,7 +2948,7 @@
             <w:r>
               <w:rPr>
                 <w:rFonts w:ascii="Microsoft JhengHei" w:hAnsi="Microsoft JhengHei" w:eastAsia="Microsoft JhengHei"/>
-                <w:sz w:val="18"/>
+                <w:sz w:val="17"/>
               </w:rPr>
               <w:t>requisition、candidate 必填；resume 可空；同一人才對同一職缺不可重複</w:t>
             </w:r>
@@ -2217,7 +2966,7 @@
             <w:r>
               <w:rPr>
                 <w:rFonts w:ascii="Microsoft JhengHei" w:hAnsi="Microsoft JhengHei" w:eastAsia="Microsoft JhengHei"/>
-                <w:sz w:val="18"/>
+                <w:sz w:val="17"/>
               </w:rPr>
               <w:t>公開應徵 API或結構化 client</w:t>
             </w:r>
@@ -2237,7 +2986,7 @@
             <w:r>
               <w:rPr>
                 <w:rFonts w:ascii="Microsoft JhengHei" w:hAnsi="Microsoft JhengHei" w:eastAsia="Microsoft JhengHei"/>
-                <w:sz w:val="18"/>
+                <w:sz w:val="17"/>
               </w:rPr>
               <w:t>match_results</w:t>
             </w:r>
@@ -2255,7 +3004,7 @@
             <w:r>
               <w:rPr>
                 <w:rFonts w:ascii="Microsoft JhengHei" w:hAnsi="Microsoft JhengHei" w:eastAsia="Microsoft JhengHei"/>
-                <w:sz w:val="18"/>
+                <w:sz w:val="17"/>
               </w:rPr>
               <w:t>可重算的職缺人才配對；門檻、總分、分項 JSON、排名、流程狀態、主管理由與計算時間</w:t>
             </w:r>
@@ -2273,7 +3022,7 @@
             <w:r>
               <w:rPr>
                 <w:rFonts w:ascii="Microsoft JhengHei" w:hAnsi="Microsoft JhengHei" w:eastAsia="Microsoft JhengHei"/>
-                <w:sz w:val="18"/>
+                <w:sz w:val="17"/>
               </w:rPr>
               <w:t>requisition、candidate；feedback user</w:t>
             </w:r>
@@ -2291,7 +3040,7 @@
             <w:r>
               <w:rPr>
                 <w:rFonts w:ascii="Microsoft JhengHei" w:hAnsi="Microsoft JhengHei" w:eastAsia="Microsoft JhengHei"/>
-                <w:sz w:val="18"/>
+                <w:sz w:val="17"/>
               </w:rPr>
               <w:t>HR 後台「重新計算配對」及後續狀態／主管回饋</w:t>
             </w:r>
@@ -2347,7 +3096,7 @@
               <w:rPr>
                 <w:rFonts w:ascii="Microsoft JhengHei" w:hAnsi="Microsoft JhengHei" w:eastAsia="Microsoft JhengHei"/>
                 <w:b/>
-                <w:sz w:val="18"/>
+                <w:sz w:val="17"/>
               </w:rPr>
               <w:t>資料表</w:t>
             </w:r>
@@ -2367,7 +3116,7 @@
               <w:rPr>
                 <w:rFonts w:ascii="Microsoft JhengHei" w:hAnsi="Microsoft JhengHei" w:eastAsia="Microsoft JhengHei"/>
                 <w:b/>
-                <w:sz w:val="18"/>
+                <w:sz w:val="17"/>
               </w:rPr>
               <w:t>用途與主要欄位</w:t>
             </w:r>
@@ -2387,7 +3136,7 @@
               <w:rPr>
                 <w:rFonts w:ascii="Microsoft JhengHei" w:hAnsi="Microsoft JhengHei" w:eastAsia="Microsoft JhengHei"/>
                 <w:b/>
-                <w:sz w:val="18"/>
+                <w:sz w:val="17"/>
               </w:rPr>
               <w:t>關聯</w:t>
             </w:r>
@@ -2407,7 +3156,7 @@
               <w:rPr>
                 <w:rFonts w:ascii="Microsoft JhengHei" w:hAnsi="Microsoft JhengHei" w:eastAsia="Microsoft JhengHei"/>
                 <w:b/>
-                <w:sz w:val="18"/>
+                <w:sz w:val="17"/>
               </w:rPr>
               <w:t>資料來源</w:t>
             </w:r>
@@ -2427,7 +3176,7 @@
             <w:r>
               <w:rPr>
                 <w:rFonts w:ascii="Microsoft JhengHei" w:hAnsi="Microsoft JhengHei" w:eastAsia="Microsoft JhengHei"/>
-                <w:sz w:val="18"/>
+                <w:sz w:val="17"/>
               </w:rPr>
               <w:t>skill_catalog</w:t>
             </w:r>
@@ -2445,7 +3194,7 @@
             <w:r>
               <w:rPr>
                 <w:rFonts w:ascii="Microsoft JhengHei" w:hAnsi="Microsoft JhengHei" w:eastAsia="Microsoft JhengHei"/>
-                <w:sz w:val="18"/>
+                <w:sz w:val="17"/>
               </w:rPr>
               <w:t>系統技能字典；名稱、正規化名稱、啟用狀態</w:t>
             </w:r>
@@ -2463,7 +3212,7 @@
             <w:r>
               <w:rPr>
                 <w:rFonts w:ascii="Microsoft JhengHei" w:hAnsi="Microsoft JhengHei" w:eastAsia="Microsoft JhengHei"/>
-                <w:sz w:val="18"/>
+                <w:sz w:val="17"/>
               </w:rPr>
               <w:t>目前是獨立管理 catalog，尚未直接 FK 到 candidate_skills</w:t>
             </w:r>
@@ -2481,7 +3230,7 @@
             <w:r>
               <w:rPr>
                 <w:rFonts w:ascii="Microsoft JhengHei" w:hAnsi="Microsoft JhengHei" w:eastAsia="Microsoft JhengHei"/>
-                <w:sz w:val="18"/>
+                <w:sz w:val="17"/>
               </w:rPr>
               <w:t>Admin 後台</w:t>
             </w:r>
@@ -2501,7 +3250,7 @@
             <w:r>
               <w:rPr>
                 <w:rFonts w:ascii="Microsoft JhengHei" w:hAnsi="Microsoft JhengHei" w:eastAsia="Microsoft JhengHei"/>
-                <w:sz w:val="18"/>
+                <w:sz w:val="17"/>
               </w:rPr>
               <w:t>tags</w:t>
             </w:r>
@@ -2519,7 +3268,7 @@
             <w:r>
               <w:rPr>
                 <w:rFonts w:ascii="Microsoft JhengHei" w:hAnsi="Microsoft JhengHei" w:eastAsia="Microsoft JhengHei"/>
-                <w:sz w:val="18"/>
+                <w:sz w:val="17"/>
               </w:rPr>
               <w:t>分類標籤字典；名稱、category、啟用狀態</w:t>
             </w:r>
@@ -2537,7 +3286,7 @@
             <w:r>
               <w:rPr>
                 <w:rFonts w:ascii="Microsoft JhengHei" w:hAnsi="Microsoft JhengHei" w:eastAsia="Microsoft JhengHei"/>
-                <w:sz w:val="18"/>
+                <w:sz w:val="17"/>
               </w:rPr>
               <w:t>目前尚無 candidate-tag 關聯表</w:t>
             </w:r>
@@ -2555,7 +3304,7 @@
             <w:r>
               <w:rPr>
                 <w:rFonts w:ascii="Microsoft JhengHei" w:hAnsi="Microsoft JhengHei" w:eastAsia="Microsoft JhengHei"/>
-                <w:sz w:val="18"/>
+                <w:sz w:val="17"/>
               </w:rPr>
               <w:t>Admin 後台</w:t>
             </w:r>
@@ -2575,7 +3324,7 @@
             <w:r>
               <w:rPr>
                 <w:rFonts w:ascii="Microsoft JhengHei" w:hAnsi="Microsoft JhengHei" w:eastAsia="Microsoft JhengHei"/>
-                <w:sz w:val="18"/>
+                <w:sz w:val="17"/>
               </w:rPr>
               <w:t>system_settings</w:t>
             </w:r>
@@ -2593,7 +3342,7 @@
             <w:r>
               <w:rPr>
                 <w:rFonts w:ascii="Microsoft JhengHei" w:hAnsi="Microsoft JhengHei" w:eastAsia="Microsoft JhengHei"/>
-                <w:sz w:val="18"/>
+                <w:sz w:val="17"/>
               </w:rPr>
               <w:t>JSON／字串等系統設定；key、value、說明、是否秘密</w:t>
             </w:r>
@@ -2611,7 +3360,7 @@
             <w:r>
               <w:rPr>
                 <w:rFonts w:ascii="Microsoft JhengHei" w:hAnsi="Microsoft JhengHei" w:eastAsia="Microsoft JhengHei"/>
-                <w:sz w:val="18"/>
+                <w:sz w:val="17"/>
               </w:rPr>
               <w:t>無外鍵；秘密值 API 不回傳明文</w:t>
             </w:r>
@@ -2629,7 +3378,7 @@
             <w:r>
               <w:rPr>
                 <w:rFonts w:ascii="Microsoft JhengHei" w:hAnsi="Microsoft JhengHei" w:eastAsia="Microsoft JhengHei"/>
-                <w:sz w:val="18"/>
+                <w:sz w:val="17"/>
               </w:rPr>
               <w:t>Admin 後台</w:t>
             </w:r>
@@ -2649,7 +3398,7 @@
             <w:r>
               <w:rPr>
                 <w:rFonts w:ascii="Microsoft JhengHei" w:hAnsi="Microsoft JhengHei" w:eastAsia="Microsoft JhengHei"/>
-                <w:sz w:val="18"/>
+                <w:sz w:val="17"/>
               </w:rPr>
               <w:t>audit_logs</w:t>
             </w:r>
@@ -2667,7 +3416,7 @@
             <w:r>
               <w:rPr>
                 <w:rFonts w:ascii="Microsoft JhengHei" w:hAnsi="Microsoft JhengHei" w:eastAsia="Microsoft JhengHei"/>
-                <w:sz w:val="18"/>
+                <w:sz w:val="17"/>
               </w:rPr>
               <w:t>登入、管理異動與 PII 讀取稽核；actor、action、resource、department、details、IP、User-Agent、時間</w:t>
             </w:r>
@@ -2685,7 +3434,7 @@
             <w:r>
               <w:rPr>
                 <w:rFonts w:ascii="Microsoft JhengHei" w:hAnsi="Microsoft JhengHei" w:eastAsia="Microsoft JhengHei"/>
-                <w:sz w:val="18"/>
+                <w:sz w:val="17"/>
               </w:rPr>
               <w:t>actor user 與 department 可為空</w:t>
             </w:r>
@@ -2703,7 +3452,7 @@
             <w:r>
               <w:rPr>
                 <w:rFonts w:ascii="Microsoft JhengHei" w:hAnsi="Microsoft JhengHei" w:eastAsia="Microsoft JhengHei"/>
-                <w:sz w:val="18"/>
+                <w:sz w:val="17"/>
               </w:rPr>
               <w:t>Auth、Admin 操作，以及人才詳情讀取 dependency</w:t>
             </w:r>
@@ -2952,7 +3701,7 @@
               <w:rPr>
                 <w:rFonts w:ascii="Microsoft JhengHei" w:hAnsi="Microsoft JhengHei" w:eastAsia="Microsoft JhengHei"/>
                 <w:b/>
-                <w:sz w:val="18"/>
+                <w:sz w:val="17"/>
               </w:rPr>
               <w:t>路由群組</w:t>
             </w:r>
@@ -2972,7 +3721,7 @@
               <w:rPr>
                 <w:rFonts w:ascii="Microsoft JhengHei" w:hAnsi="Microsoft JhengHei" w:eastAsia="Microsoft JhengHei"/>
                 <w:b/>
-                <w:sz w:val="18"/>
+                <w:sz w:val="17"/>
               </w:rPr>
               <w:t>主要用途</w:t>
             </w:r>
@@ -2992,7 +3741,7 @@
               <w:rPr>
                 <w:rFonts w:ascii="Microsoft JhengHei" w:hAnsi="Microsoft JhengHei" w:eastAsia="Microsoft JhengHei"/>
                 <w:b/>
-                <w:sz w:val="18"/>
+                <w:sz w:val="17"/>
               </w:rPr>
               <w:t>是否需 Token</w:t>
             </w:r>
@@ -3012,7 +3761,7 @@
             <w:r>
               <w:rPr>
                 <w:rFonts w:ascii="Microsoft JhengHei" w:hAnsi="Microsoft JhengHei" w:eastAsia="Microsoft JhengHei"/>
-                <w:sz w:val="18"/>
+                <w:sz w:val="17"/>
               </w:rPr>
               <w:t>/health</w:t>
             </w:r>
@@ -3030,7 +3779,7 @@
             <w:r>
               <w:rPr>
                 <w:rFonts w:ascii="Microsoft JhengHei" w:hAnsi="Microsoft JhengHei" w:eastAsia="Microsoft JhengHei"/>
-                <w:sz w:val="18"/>
+                <w:sz w:val="17"/>
               </w:rPr>
               <w:t>服務存活檢查</w:t>
             </w:r>
@@ -3048,7 +3797,7 @@
             <w:r>
               <w:rPr>
                 <w:rFonts w:ascii="Microsoft JhengHei" w:hAnsi="Microsoft JhengHei" w:eastAsia="Microsoft JhengHei"/>
-                <w:sz w:val="18"/>
+                <w:sz w:val="17"/>
               </w:rPr>
               <w:t>否</w:t>
             </w:r>
@@ -3068,7 +3817,7 @@
             <w:r>
               <w:rPr>
                 <w:rFonts w:ascii="Microsoft JhengHei" w:hAnsi="Microsoft JhengHei" w:eastAsia="Microsoft JhengHei"/>
-                <w:sz w:val="18"/>
+                <w:sz w:val="17"/>
               </w:rPr>
               <w:t>/public/jobs*</w:t>
             </w:r>
@@ -3086,7 +3835,7 @@
             <w:r>
               <w:rPr>
                 <w:rFonts w:ascii="Microsoft JhengHei" w:hAnsi="Microsoft JhengHei" w:eastAsia="Microsoft JhengHei"/>
-                <w:sz w:val="18"/>
+                <w:sz w:val="17"/>
               </w:rPr>
               <w:t>公開職缺列表／詳情</w:t>
             </w:r>
@@ -3104,7 +3853,7 @@
             <w:r>
               <w:rPr>
                 <w:rFonts w:ascii="Microsoft JhengHei" w:hAnsi="Microsoft JhengHei" w:eastAsia="Microsoft JhengHei"/>
-                <w:sz w:val="18"/>
+                <w:sz w:val="17"/>
               </w:rPr>
               <w:t>否</w:t>
             </w:r>
@@ -3124,7 +3873,7 @@
             <w:r>
               <w:rPr>
                 <w:rFonts w:ascii="Microsoft JhengHei" w:hAnsi="Microsoft JhengHei" w:eastAsia="Microsoft JhengHei"/>
-                <w:sz w:val="18"/>
+                <w:sz w:val="17"/>
               </w:rPr>
               <w:t>/public/applications、/public/talent-pool</w:t>
             </w:r>
@@ -3142,7 +3891,7 @@
             <w:r>
               <w:rPr>
                 <w:rFonts w:ascii="Microsoft JhengHei" w:hAnsi="Microsoft JhengHei" w:eastAsia="Microsoft JhengHei"/>
-                <w:sz w:val="18"/>
+                <w:sz w:val="17"/>
               </w:rPr>
               <w:t>multipart 應徵／加入人才庫；履歷檔為選填</w:t>
             </w:r>
@@ -3160,7 +3909,7 @@
             <w:r>
               <w:rPr>
                 <w:rFonts w:ascii="Microsoft JhengHei" w:hAnsi="Microsoft JhengHei" w:eastAsia="Microsoft JhengHei"/>
-                <w:sz w:val="18"/>
+                <w:sz w:val="17"/>
               </w:rPr>
               <w:t>否</w:t>
             </w:r>
@@ -3180,7 +3929,7 @@
             <w:r>
               <w:rPr>
                 <w:rFonts w:ascii="Microsoft JhengHei" w:hAnsi="Microsoft JhengHei" w:eastAsia="Microsoft JhengHei"/>
-                <w:sz w:val="18"/>
+                <w:sz w:val="17"/>
               </w:rPr>
               <w:t>/public/applications/json</w:t>
             </w:r>
@@ -3198,7 +3947,7 @@
             <w:r>
               <w:rPr>
                 <w:rFonts w:ascii="Microsoft JhengHei" w:hAnsi="Microsoft JhengHei" w:eastAsia="Microsoft JhengHei"/>
-                <w:sz w:val="18"/>
+                <w:sz w:val="17"/>
               </w:rPr>
               <w:t>結構化 client 投遞端點</w:t>
             </w:r>
@@ -3216,7 +3965,7 @@
             <w:r>
               <w:rPr>
                 <w:rFonts w:ascii="Microsoft JhengHei" w:hAnsi="Microsoft JhengHei" w:eastAsia="Microsoft JhengHei"/>
-                <w:sz w:val="18"/>
+                <w:sz w:val="17"/>
               </w:rPr>
               <w:t>否；正式公開前應依風險決定是否保留</w:t>
             </w:r>
@@ -3236,7 +3985,7 @@
             <w:r>
               <w:rPr>
                 <w:rFonts w:ascii="Microsoft JhengHei" w:hAnsi="Microsoft JhengHei" w:eastAsia="Microsoft JhengHei"/>
-                <w:sz w:val="18"/>
+                <w:sz w:val="17"/>
               </w:rPr>
               <w:t>/auth/login、/auth/refresh</w:t>
             </w:r>
@@ -3254,7 +4003,7 @@
             <w:r>
               <w:rPr>
                 <w:rFonts w:ascii="Microsoft JhengHei" w:hAnsi="Microsoft JhengHei" w:eastAsia="Microsoft JhengHei"/>
-                <w:sz w:val="18"/>
+                <w:sz w:val="17"/>
               </w:rPr>
               <w:t>登入與 refresh token 輪替</w:t>
             </w:r>
@@ -3272,7 +4021,7 @@
             <w:r>
               <w:rPr>
                 <w:rFonts w:ascii="Microsoft JhengHei" w:hAnsi="Microsoft JhengHei" w:eastAsia="Microsoft JhengHei"/>
-                <w:sz w:val="18"/>
+                <w:sz w:val="17"/>
               </w:rPr>
               <w:t>否</w:t>
             </w:r>
@@ -3292,7 +4041,7 @@
             <w:r>
               <w:rPr>
                 <w:rFonts w:ascii="Microsoft JhengHei" w:hAnsi="Microsoft JhengHei" w:eastAsia="Microsoft JhengHei"/>
-                <w:sz w:val="18"/>
+                <w:sz w:val="17"/>
               </w:rPr>
               <w:t>/auth/me</w:t>
             </w:r>
@@ -3310,7 +4059,7 @@
             <w:r>
               <w:rPr>
                 <w:rFonts w:ascii="Microsoft JhengHei" w:hAnsi="Microsoft JhengHei" w:eastAsia="Microsoft JhengHei"/>
-                <w:sz w:val="18"/>
+                <w:sz w:val="17"/>
               </w:rPr>
               <w:t>目前登入者</w:t>
             </w:r>
@@ -3328,7 +4077,7 @@
             <w:r>
               <w:rPr>
                 <w:rFonts w:ascii="Microsoft JhengHei" w:hAnsi="Microsoft JhengHei" w:eastAsia="Microsoft JhengHei"/>
-                <w:sz w:val="18"/>
+                <w:sz w:val="17"/>
               </w:rPr>
               <w:t>是</w:t>
             </w:r>
@@ -3348,7 +4097,7 @@
             <w:r>
               <w:rPr>
                 <w:rFonts w:ascii="Microsoft JhengHei" w:hAnsi="Microsoft JhengHei" w:eastAsia="Microsoft JhengHei"/>
-                <w:sz w:val="18"/>
+                <w:sz w:val="17"/>
               </w:rPr>
               <w:t>/candidates*</w:t>
             </w:r>
@@ -3366,7 +4115,7 @@
             <w:r>
               <w:rPr>
                 <w:rFonts w:ascii="Microsoft JhengHei" w:hAnsi="Microsoft JhengHei" w:eastAsia="Microsoft JhengHei"/>
-                <w:sz w:val="18"/>
+                <w:sz w:val="17"/>
               </w:rPr>
               <w:t>人才 CRUD、活動、軟刪除</w:t>
             </w:r>
@@ -3384,7 +4133,7 @@
             <w:r>
               <w:rPr>
                 <w:rFonts w:ascii="Microsoft JhengHei" w:hAnsi="Microsoft JhengHei" w:eastAsia="Microsoft JhengHei"/>
-                <w:sz w:val="18"/>
+                <w:sz w:val="17"/>
               </w:rPr>
               <w:t>是</w:t>
             </w:r>
@@ -3404,7 +4153,7 @@
             <w:r>
               <w:rPr>
                 <w:rFonts w:ascii="Microsoft JhengHei" w:hAnsi="Microsoft JhengHei" w:eastAsia="Microsoft JhengHei"/>
-                <w:sz w:val="18"/>
+                <w:sz w:val="17"/>
               </w:rPr>
               <w:t>/resumes*</w:t>
             </w:r>
@@ -3422,7 +4171,7 @@
             <w:r>
               <w:rPr>
                 <w:rFonts w:ascii="Microsoft JhengHei" w:hAnsi="Microsoft JhengHei" w:eastAsia="Microsoft JhengHei"/>
-                <w:sz w:val="18"/>
+                <w:sz w:val="17"/>
               </w:rPr>
               <w:t>批次上傳、列表、詳情、校對、重解析、確認入庫</w:t>
             </w:r>
@@ -3440,7 +4189,7 @@
             <w:r>
               <w:rPr>
                 <w:rFonts w:ascii="Microsoft JhengHei" w:hAnsi="Microsoft JhengHei" w:eastAsia="Microsoft JhengHei"/>
-                <w:sz w:val="18"/>
+                <w:sz w:val="17"/>
               </w:rPr>
               <w:t>是</w:t>
             </w:r>
@@ -3460,7 +4209,7 @@
             <w:r>
               <w:rPr>
                 <w:rFonts w:ascii="Microsoft JhengHei" w:hAnsi="Microsoft JhengHei" w:eastAsia="Microsoft JhengHei"/>
-                <w:sz w:val="18"/>
+                <w:sz w:val="17"/>
               </w:rPr>
               <w:t>/requisitions*</w:t>
             </w:r>
@@ -3478,7 +4227,7 @@
             <w:r>
               <w:rPr>
                 <w:rFonts w:ascii="Microsoft JhengHei" w:hAnsi="Microsoft JhengHei" w:eastAsia="Microsoft JhengHei"/>
-                <w:sz w:val="18"/>
+                <w:sz w:val="17"/>
               </w:rPr>
               <w:t>職缺 CRUD、核准</w:t>
             </w:r>
@@ -3496,7 +4245,7 @@
             <w:r>
               <w:rPr>
                 <w:rFonts w:ascii="Microsoft JhengHei" w:hAnsi="Microsoft JhengHei" w:eastAsia="Microsoft JhengHei"/>
-                <w:sz w:val="18"/>
+                <w:sz w:val="17"/>
               </w:rPr>
               <w:t>是；非 Admin 受部門限制</w:t>
             </w:r>
@@ -3516,7 +4265,7 @@
             <w:r>
               <w:rPr>
                 <w:rFonts w:ascii="Microsoft JhengHei" w:hAnsi="Microsoft JhengHei" w:eastAsia="Microsoft JhengHei"/>
-                <w:sz w:val="18"/>
+                <w:sz w:val="17"/>
               </w:rPr>
               <w:t>/requisitions/{id}/matches、/matches*</w:t>
             </w:r>
@@ -3534,7 +4283,7 @@
             <w:r>
               <w:rPr>
                 <w:rFonts w:ascii="Microsoft JhengHei" w:hAnsi="Microsoft JhengHei" w:eastAsia="Microsoft JhengHei"/>
-                <w:sz w:val="18"/>
+                <w:sz w:val="17"/>
               </w:rPr>
               <w:t>配對列表、重算、狀態、主管回饋</w:t>
             </w:r>
@@ -3552,7 +4301,7 @@
             <w:r>
               <w:rPr>
                 <w:rFonts w:ascii="Microsoft JhengHei" w:hAnsi="Microsoft JhengHei" w:eastAsia="Microsoft JhengHei"/>
-                <w:sz w:val="18"/>
+                <w:sz w:val="17"/>
               </w:rPr>
               <w:t>是；受職缺部門限制</w:t>
             </w:r>
@@ -3572,7 +4321,7 @@
             <w:r>
               <w:rPr>
                 <w:rFonts w:ascii="Microsoft JhengHei" w:hAnsi="Microsoft JhengHei" w:eastAsia="Microsoft JhengHei"/>
-                <w:sz w:val="18"/>
+                <w:sz w:val="17"/>
               </w:rPr>
               <w:t>/reports/funnel、time-to-fill、sources、talent-pool</w:t>
             </w:r>
@@ -3590,7 +4339,7 @@
             <w:r>
               <w:rPr>
                 <w:rFonts w:ascii="Microsoft JhengHei" w:hAnsi="Microsoft JhengHei" w:eastAsia="Microsoft JhengHei"/>
-                <w:sz w:val="18"/>
+                <w:sz w:val="17"/>
               </w:rPr>
               <w:t>真實 DB 聚合報表</w:t>
             </w:r>
@@ -3608,7 +4357,7 @@
             <w:r>
               <w:rPr>
                 <w:rFonts w:ascii="Microsoft JhengHei" w:hAnsi="Microsoft JhengHei" w:eastAsia="Microsoft JhengHei"/>
-                <w:sz w:val="18"/>
+                <w:sz w:val="17"/>
               </w:rPr>
               <w:t>是；非 Admin 自動套用所屬部門</w:t>
             </w:r>
@@ -3628,7 +4377,7 @@
             <w:r>
               <w:rPr>
                 <w:rFonts w:ascii="Microsoft JhengHei" w:hAnsi="Microsoft JhengHei" w:eastAsia="Microsoft JhengHei"/>
-                <w:sz w:val="18"/>
+                <w:sz w:val="17"/>
               </w:rPr>
               <w:t>/admin/*</w:t>
             </w:r>
@@ -3646,7 +4395,7 @@
             <w:r>
               <w:rPr>
                 <w:rFonts w:ascii="Microsoft JhengHei" w:hAnsi="Microsoft JhengHei" w:eastAsia="Microsoft JhengHei"/>
-                <w:sz w:val="18"/>
+                <w:sz w:val="17"/>
               </w:rPr>
               <w:t>使用者、部門、技能、標籤、設定、稽核</w:t>
             </w:r>
@@ -3664,7 +4413,7 @@
             <w:r>
               <w:rPr>
                 <w:rFonts w:ascii="Microsoft JhengHei" w:hAnsi="Microsoft JhengHei" w:eastAsia="Microsoft JhengHei"/>
-                <w:sz w:val="18"/>
+                <w:sz w:val="17"/>
               </w:rPr>
               <w:t>僅 Admin</w:t>
             </w:r>
@@ -3756,7 +4505,7 @@
               <w:rPr>
                 <w:rFonts w:ascii="Microsoft JhengHei" w:hAnsi="Microsoft JhengHei" w:eastAsia="Microsoft JhengHei"/>
                 <w:b/>
-                <w:sz w:val="18"/>
+                <w:sz w:val="17"/>
               </w:rPr>
               <w:t>頁面</w:t>
             </w:r>
@@ -3776,7 +4525,7 @@
               <w:rPr>
                 <w:rFonts w:ascii="Microsoft JhengHei" w:hAnsi="Microsoft JhengHei" w:eastAsia="Microsoft JhengHei"/>
                 <w:b/>
-                <w:sz w:val="18"/>
+                <w:sz w:val="17"/>
               </w:rPr>
               <w:t>現有功能</w:t>
             </w:r>
@@ -3796,7 +4545,7 @@
             <w:r>
               <w:rPr>
                 <w:rFonts w:ascii="Microsoft JhengHei" w:hAnsi="Microsoft JhengHei" w:eastAsia="Microsoft JhengHei"/>
-                <w:sz w:val="18"/>
+                <w:sz w:val="17"/>
               </w:rPr>
               <w:t>工作總覽</w:t>
             </w:r>
@@ -3814,7 +4563,7 @@
             <w:r>
               <w:rPr>
                 <w:rFonts w:ascii="Microsoft JhengHei" w:hAnsi="Microsoft JhengHei" w:eastAsia="Microsoft JhengHei"/>
-                <w:sz w:val="18"/>
+                <w:sz w:val="17"/>
               </w:rPr>
               <w:t>人才、待校對履歷、解析佇列、招募中職缺即時摘要</w:t>
             </w:r>
@@ -3834,7 +4583,7 @@
             <w:r>
               <w:rPr>
                 <w:rFonts w:ascii="Microsoft JhengHei" w:hAnsi="Microsoft JhengHei" w:eastAsia="Microsoft JhengHei"/>
-                <w:sz w:val="18"/>
+                <w:sz w:val="17"/>
               </w:rPr>
               <w:t>人才資料庫</w:t>
             </w:r>
@@ -3852,7 +4601,7 @@
             <w:r>
               <w:rPr>
                 <w:rFonts w:ascii="Microsoft JhengHei" w:hAnsi="Microsoft JhengHei" w:eastAsia="Microsoft JhengHei"/>
-                <w:sz w:val="18"/>
+                <w:sz w:val="17"/>
               </w:rPr>
               <w:t>搜尋、狀態篩選、手動新增／編輯、詳情、活動紀錄、軟刪除／封存</w:t>
             </w:r>
@@ -3872,7 +4621,7 @@
             <w:r>
               <w:rPr>
                 <w:rFonts w:ascii="Microsoft JhengHei" w:hAnsi="Microsoft JhengHei" w:eastAsia="Microsoft JhengHei"/>
-                <w:sz w:val="18"/>
+                <w:sz w:val="17"/>
               </w:rPr>
               <w:t>履歷匯入與校對</w:t>
             </w:r>
@@ -3890,7 +4639,7 @@
             <w:r>
               <w:rPr>
                 <w:rFonts w:ascii="Microsoft JhengHei" w:hAnsi="Microsoft JhengHei" w:eastAsia="Microsoft JhengHei"/>
-                <w:sz w:val="18"/>
+                <w:sz w:val="17"/>
               </w:rPr>
               <w:t>標記 104／1111／一般／自製來源、批次上傳、查看解析結果、人工校對、重解析、確認入庫</w:t>
             </w:r>
@@ -3910,7 +4659,7 @@
             <w:r>
               <w:rPr>
                 <w:rFonts w:ascii="Microsoft JhengHei" w:hAnsi="Microsoft JhengHei" w:eastAsia="Microsoft JhengHei"/>
-                <w:sz w:val="18"/>
+                <w:sz w:val="17"/>
               </w:rPr>
               <w:t>職缺管理</w:t>
             </w:r>
@@ -3928,7 +4677,7 @@
             <w:r>
               <w:rPr>
                 <w:rFonts w:ascii="Microsoft JhengHei" w:hAnsi="Microsoft JhengHei" w:eastAsia="Microsoft JhengHei"/>
-                <w:sz w:val="18"/>
+                <w:sz w:val="17"/>
               </w:rPr>
               <w:t>建立、編輯、核准職缺；非 Admin 只看到所屬部門資料</w:t>
             </w:r>
@@ -3948,7 +4697,7 @@
             <w:r>
               <w:rPr>
                 <w:rFonts w:ascii="Microsoft JhengHei" w:hAnsi="Microsoft JhengHei" w:eastAsia="Microsoft JhengHei"/>
-                <w:sz w:val="18"/>
+                <w:sz w:val="17"/>
               </w:rPr>
               <w:t>智慧配對</w:t>
             </w:r>
@@ -3966,7 +4715,7 @@
             <w:r>
               <w:rPr>
                 <w:rFonts w:ascii="Microsoft JhengHei" w:hAnsi="Microsoft JhengHei" w:eastAsia="Microsoft JhengHei"/>
-                <w:sz w:val="18"/>
+                <w:sz w:val="17"/>
               </w:rPr>
               <w:t>選職缺、重算、依分數排序、查看各分項命中／缺口、更新狀態、填主管拒絕理由</w:t>
             </w:r>
@@ -3986,7 +4735,7 @@
             <w:r>
               <w:rPr>
                 <w:rFonts w:ascii="Microsoft JhengHei" w:hAnsi="Microsoft JhengHei" w:eastAsia="Microsoft JhengHei"/>
-                <w:sz w:val="18"/>
+                <w:sz w:val="17"/>
               </w:rPr>
               <w:t>數據報表</w:t>
             </w:r>
@@ -4004,7 +4753,7 @@
             <w:r>
               <w:rPr>
                 <w:rFonts w:ascii="Microsoft JhengHei" w:hAnsi="Microsoft JhengHei" w:eastAsia="Microsoft JhengHei"/>
-                <w:sz w:val="18"/>
+                <w:sz w:val="17"/>
               </w:rPr>
               <w:t>日期與部門篩選、漏斗、補齊天數、來源、技能／城市／年資／學歷／月增量</w:t>
             </w:r>
@@ -4024,7 +4773,7 @@
             <w:r>
               <w:rPr>
                 <w:rFonts w:ascii="Microsoft JhengHei" w:hAnsi="Microsoft JhengHei" w:eastAsia="Microsoft JhengHei"/>
-                <w:sz w:val="18"/>
+                <w:sz w:val="17"/>
               </w:rPr>
               <w:t>帳號與權限</w:t>
             </w:r>
@@ -4042,7 +4791,7 @@
             <w:r>
               <w:rPr>
                 <w:rFonts w:ascii="Microsoft JhengHei" w:hAnsi="Microsoft JhengHei" w:eastAsia="Microsoft JhengHei"/>
-                <w:sz w:val="18"/>
+                <w:sz w:val="17"/>
               </w:rPr>
               <w:t>Admin 管理使用者、部門、技能、標籤、設定與 audit log</w:t>
             </w:r>
@@ -4141,7 +4890,7 @@
               <w:rPr>
                 <w:rFonts w:ascii="Microsoft JhengHei" w:hAnsi="Microsoft JhengHei" w:eastAsia="Microsoft JhengHei"/>
                 <w:b/>
-                <w:sz w:val="18"/>
+                <w:sz w:val="17"/>
               </w:rPr>
               <w:t>服務</w:t>
             </w:r>
@@ -4161,7 +4910,7 @@
               <w:rPr>
                 <w:rFonts w:ascii="Microsoft JhengHei" w:hAnsi="Microsoft JhengHei" w:eastAsia="Microsoft JhengHei"/>
                 <w:b/>
-                <w:sz w:val="18"/>
+                <w:sz w:val="17"/>
               </w:rPr>
               <w:t>URL／用途</w:t>
             </w:r>
@@ -4181,7 +4930,7 @@
             <w:r>
               <w:rPr>
                 <w:rFonts w:ascii="Microsoft JhengHei" w:hAnsi="Microsoft JhengHei" w:eastAsia="Microsoft JhengHei"/>
-                <w:sz w:val="18"/>
+                <w:sz w:val="17"/>
               </w:rPr>
               <w:t>HR 後台</w:t>
             </w:r>
@@ -4199,7 +4948,7 @@
             <w:r>
               <w:rPr>
                 <w:rFonts w:ascii="Microsoft JhengHei" w:hAnsi="Microsoft JhengHei" w:eastAsia="Microsoft JhengHei"/>
-                <w:sz w:val="18"/>
+                <w:sz w:val="17"/>
               </w:rPr>
               <w:t>&lt;http://localhost:8080&gt;</w:t>
             </w:r>
@@ -4219,7 +4968,7 @@
             <w:r>
               <w:rPr>
                 <w:rFonts w:ascii="Microsoft JhengHei" w:hAnsi="Microsoft JhengHei" w:eastAsia="Microsoft JhengHei"/>
-                <w:sz w:val="18"/>
+                <w:sz w:val="17"/>
               </w:rPr>
               <w:t>公開人才前端</w:t>
             </w:r>
@@ -4237,7 +4986,7 @@
             <w:r>
               <w:rPr>
                 <w:rFonts w:ascii="Microsoft JhengHei" w:hAnsi="Microsoft JhengHei" w:eastAsia="Microsoft JhengHei"/>
-                <w:sz w:val="18"/>
+                <w:sz w:val="17"/>
               </w:rPr>
               <w:t>&lt;http://localhost:8081&gt;</w:t>
             </w:r>
@@ -4257,7 +5006,7 @@
             <w:r>
               <w:rPr>
                 <w:rFonts w:ascii="Microsoft JhengHei" w:hAnsi="Microsoft JhengHei" w:eastAsia="Microsoft JhengHei"/>
-                <w:sz w:val="18"/>
+                <w:sz w:val="17"/>
               </w:rPr>
               <w:t>Backend／OpenAPI</w:t>
             </w:r>
@@ -4275,7 +5024,7 @@
             <w:r>
               <w:rPr>
                 <w:rFonts w:ascii="Microsoft JhengHei" w:hAnsi="Microsoft JhengHei" w:eastAsia="Microsoft JhengHei"/>
-                <w:sz w:val="18"/>
+                <w:sz w:val="17"/>
               </w:rPr>
               <w:t>&lt;http://localhost:8000/docs&gt;</w:t>
             </w:r>
@@ -4295,7 +5044,7 @@
             <w:r>
               <w:rPr>
                 <w:rFonts w:ascii="Microsoft JhengHei" w:hAnsi="Microsoft JhengHei" w:eastAsia="Microsoft JhengHei"/>
-                <w:sz w:val="18"/>
+                <w:sz w:val="17"/>
               </w:rPr>
               <w:t>PostgreSQL</w:t>
             </w:r>
@@ -4313,7 +5062,7 @@
             <w:r>
               <w:rPr>
                 <w:rFonts w:ascii="Microsoft JhengHei" w:hAnsi="Microsoft JhengHei" w:eastAsia="Microsoft JhengHei"/>
-                <w:sz w:val="18"/>
+                <w:sz w:val="17"/>
               </w:rPr>
               <w:t>只供 Compose 內部服務使用；主 compose 未映射 host port</w:t>
             </w:r>
@@ -4333,7 +5082,7 @@
             <w:r>
               <w:rPr>
                 <w:rFonts w:ascii="Microsoft JhengHei" w:hAnsi="Microsoft JhengHei" w:eastAsia="Microsoft JhengHei"/>
-                <w:sz w:val="18"/>
+                <w:sz w:val="17"/>
               </w:rPr>
               <w:t>Redis</w:t>
             </w:r>
@@ -4351,7 +5100,7 @@
             <w:r>
               <w:rPr>
                 <w:rFonts w:ascii="Microsoft JhengHei" w:hAnsi="Microsoft JhengHei" w:eastAsia="Microsoft JhengHei"/>
-                <w:sz w:val="18"/>
+                <w:sz w:val="17"/>
               </w:rPr>
               <w:t>已啟動，但目前核心同步流程沒有 Celery worker service</w:t>
             </w:r>
@@ -4695,18 +5444,10 @@
       <w:jc w:val="center"/>
     </w:pPr>
     <w:r>
-      <w:rPr>
-        <w:rFonts w:ascii="Microsoft JhengHei" w:hAnsi="Microsoft JhengHei" w:eastAsia="Microsoft JhengHei"/>
-        <w:sz w:val="16"/>
-      </w:rPr>
       <w:t xml:space="preserve">? </w:t>
     </w:r>
     <w:fldSimple w:instr="PAGE"/>
     <w:r>
-      <w:rPr>
-        <w:rFonts w:ascii="Microsoft JhengHei" w:hAnsi="Microsoft JhengHei" w:eastAsia="Microsoft JhengHei"/>
-        <w:sz w:val="16"/>
-      </w:rPr>
       <w:t xml:space="preserve"> ?</w:t>
     </w:r>
   </w:p>
@@ -4721,11 +5462,6 @@
       <w:jc w:val="right"/>
     </w:pPr>
     <w:r>
-      <w:rPr>
-        <w:rFonts w:ascii="Microsoft JhengHei" w:hAnsi="Microsoft JhengHei" w:eastAsia="Microsoft JhengHei"/>
-        <w:color w:val="5A6E66"/>
-        <w:sz w:val="16"/>
-      </w:rPr>
       <w:t>TalentHub?????????????</w:t>
     </w:r>
   </w:p>
@@ -5096,10 +5832,11 @@
     <w:qFormat/>
     <w:rsid w:val="00FC693F"/>
     <w:pPr>
-      <w:spacing w:after="100" w:line="312" w:lineRule="auto"/>
+      <w:spacing w:line="312" w:lineRule="auto" w:after="100"/>
     </w:pPr>
     <w:rPr>
       <w:rFonts w:ascii="Microsoft JhengHei" w:hAnsi="Microsoft JhengHei" w:eastAsia="Microsoft JhengHei"/>
+      <w:b w:val="0"/>
       <w:sz w:val="21"/>
     </w:rPr>
   </w:style>
@@ -5158,7 +5895,7 @@
     <w:pPr>
       <w:keepNext/>
       <w:keepLines/>
-      <w:spacing w:before="240" w:after="120"/>
+      <w:spacing w:before="480" w:after="0"/>
       <w:outlineLvl w:val="0"/>
     </w:pPr>
     <w:rPr>
@@ -5182,7 +5919,7 @@
     <w:pPr>
       <w:keepNext/>
       <w:keepLines/>
-      <w:spacing w:before="240" w:after="120"/>
+      <w:spacing w:before="200" w:after="0"/>
       <w:outlineLvl w:val="1"/>
     </w:pPr>
     <w:rPr>
@@ -5206,7 +5943,7 @@
     <w:pPr>
       <w:keepNext/>
       <w:keepLines/>
-      <w:spacing w:before="240" w:after="120"/>
+      <w:spacing w:before="200" w:after="0"/>
       <w:outlineLvl w:val="2"/>
     </w:pPr>
     <w:rPr>
@@ -5448,7 +6185,7 @@
       <w:pBdr>
         <w:bottom w:val="single" w:sz="8" w:space="4" w:color="4F81BD" w:themeColor="accent1"/>
       </w:pBdr>
-      <w:spacing w:after="120" w:line="240" w:lineRule="auto" w:before="240"/>
+      <w:spacing w:after="300" w:line="240" w:lineRule="auto"/>
       <w:contextualSpacing/>
     </w:pPr>
     <w:rPr>
@@ -16790,12 +17527,12 @@
   <w:style w:type="paragraph" w:customStyle="1" w:styleId="CodeBlock">
     <w:name w:val="Code Block"/>
     <w:pPr>
-      <w:spacing w:after="0"/>
-      <w:ind w:left="283" w:right="283"/>
+      <w:spacing w:after="20"/>
+      <w:ind w:left="198"/>
     </w:pPr>
     <w:rPr>
       <w:rFonts w:ascii="Consolas" w:hAnsi="Consolas" w:eastAsia="Microsoft JhengHei"/>
-      <w:sz w:val="18"/>
+      <w:sz w:val="16"/>
     </w:rPr>
   </w:style>
 </w:styles>

</xml_diff>

<commit_message>
docs: sync Word manual (docs/10 .docx) with the .md updates
Add the users account-security columns (tokens_valid_after, must_change_password,
failed_login_count, locked_until), bump the Alembic head to e15b9d4c7a83, note the
requisition state machine + filled_at, and append a 2026-07-16 update summary
(database, recruitment, deployment, security, matching).

Co-Authored-By: Claude Opus 4.8 (1M context) <noreply@anthropic.com>
</commit_message>
<xml_diff>
--- a/docs/10-系統元件與資料庫使用手冊.docx
+++ b/docs/10-系統元件與資料庫使用手冊.docx
@@ -34,7 +34,7 @@
           <w:i/>
           <w:color w:val="4B5F57"/>
         </w:rPr>
-        <w:t>文件基準：2026-07-13 目前程式碼。本文以 SQLAlchemy models、Alembic migrations、</w:t>
+        <w:t>文件基準：2026-07-16 目前程式碼。本文以 SQLAlchemy models、Alembic migrations、</w:t>
       </w:r>
     </w:p>
     <w:p>
@@ -1724,7 +1724,7 @@
         <w:rPr>
           <w:rFonts w:ascii="Microsoft JhengHei" w:hAnsi="Microsoft JhengHei" w:eastAsia="Microsoft JhengHei"/>
         </w:rPr>
-        <w:t>目前 migration chain 的 head 是 f73a9c0d4b11。實際部署一律執行 Alembic，不要用 Base.metadata.create_all() 取代正式 migration：</w:t>
+        <w:t>目前 migration chain 的 head 是 e15b9d4c7a83。實際部署一律執行 Alembic，不要用 Base.metadata.create_all() 取代正式 migration：</w:t>
       </w:r>
     </w:p>
     <w:p>
@@ -2035,6 +2035,13 @@
                 <w:sz w:val="17"/>
               </w:rPr>
               <w:t>登入帳號；username、email、password_hash、display_name、role、department_id、is_active</w:t>
+            </w:r>
+            <w:r>
+              <w:rPr>
+                <w:rFonts w:ascii="Microsoft JhengHei" w:hAnsi="Microsoft JhengHei"/>
+                <w:sz w:val="17"/>
+              </w:rPr>
+              <w:t>、tokens_valid_after、must_change_password、failed_login_count、locked_until</w:t>
             </w:r>
           </w:p>
         </w:tc>
@@ -2785,6 +2792,13 @@
                 <w:sz w:val="17"/>
               </w:rPr>
               <w:t>職缺需求；單號、部門、需求人數、地點、薪資、年資／學歷條件、JD、技能 JSON、權重、狀態及發布／補齊／關閉時間</w:t>
+            </w:r>
+            <w:r>
+              <w:rPr>
+                <w:rFonts w:ascii="Microsoft JhengHei" w:hAnsi="Microsoft JhengHei"/>
+                <w:sz w:val="17"/>
+              </w:rPr>
+              <w:t>（狀態由狀態機控管；filled_at／closed_at 於狀態轉換時寫入，為 time-to-fill 報表基準）</w:t>
             </w:r>
           </w:p>
         </w:tc>
@@ -5424,6 +5438,39 @@
         <w:t>教育、經歷、標籤關聯等尚未完成 UI／schema 的後續設計。</w:t>
       </w:r>
     </w:p>
+    <w:p>
+      <w:pPr>
+        <w:pStyle w:val="Heading2"/>
+      </w:pPr>
+      <w:r>
+        <w:t>附錄：2026-07-16 更新摘要</w:t>
+      </w:r>
+    </w:p>
+    <w:p>
+      <w:r>
+        <w:t>資料庫：users 新增帳號安全欄位 tokens_valid_after（密碼變更／重設令既有 access token 失效）、must_change_password（IT 重設或管理員設定密碼後首次登入須先改密）、failed_login_count 與 locked_until（帳號級連續失敗自動過期鎖定）。Alembic head 為 e15b9d4c7a83，近期新增 d94a1f2b6c30、e15b9d4c7a83 兩個 migration。</w:t>
+      </w:r>
+    </w:p>
+    <w:p>
+      <w:r>
+        <w:t>招募：職缺需求單狀態改由狀態機控管，filled_at／closed_at 於狀態轉換時寫入，time-to-fill 報表以 filled_at 為基準。</w:t>
+      </w:r>
+    </w:p>
+    <w:p>
+      <w:r>
+        <w:t>部署：Windows LAN 服務改以 npm run build 產生靜態檔並用 vite preview 提供（非 dev server）；transcript log 具大小輪替；Backend 於 nginx 之後以 --proxy-headers 執行以取得真實用戶端 IP。</w:t>
+      </w:r>
+    </w:p>
+    <w:p>
+      <w:r>
+        <w:t>資安（詳 docs/08）：登入帳號級鎖定與未知帳號 dummy hash、掃毒非 dev 一律 fail-closed、上傳解析／OCR 移至 threadpool 並對公開上傳加 per-IP 限流、nginx 安全標頭與 CSP、容器非 root、API 綁 loopback、正式環境關閉 /docs、/health 實檢 DB、CI 加 pip-audit。</w:t>
+      </w:r>
+    </w:p>
+    <w:p>
+      <w:r>
+        <w:t>媒合：技能同義詞＋保守模糊比對、門檻可用 required_skill_ratio 軟化並接受鄰近城市、near_miss 旗標、雙語職稱比對；新增媒合評估報表端點 GET /reports/matching-evaluation（Precision@K／Recall@K／Gate 誤殺／分數校準／排名有效性）。</w:t>
+      </w:r>
+    </w:p>
     <w:sectPr>
       <w:headerReference w:type="default" r:id="rId9"/>
       <w:footerReference w:type="default" r:id="rId10"/>

</xml_diff>